<commit_message>
Added custom Excalidraw diagram, and updated BlogDoc
</commit_message>
<xml_diff>
--- a/blog-doc/Exploring K8S on vCluster, Deploying a GitOps Stack.docx
+++ b/blog-doc/Exploring K8S on vCluster, Deploying a GitOps Stack.docx
@@ -466,7 +466,7 @@
           <w:szCs w:val="24"/>
           <w:rtl w:val="0"/>
         </w:rPr>
-        <w:t xml:space="preserve"> tag (line 21). This is an important concept to remember.</w:t>
+        <w:t xml:space="preserve"> tag (line 21). This is an important concept to remember as we lay out the process and actions.</w:t>
       </w:r>
     </w:p>
     <w:p>
@@ -485,7 +485,7 @@
           <w:szCs w:val="24"/>
           <w:rtl w:val="0"/>
         </w:rPr>
-        <w:t xml:space="preserve">We will pre-configure our Kubernetes cluster with </w:t>
+        <w:t xml:space="preserve">We will start by pre-configuring our Kubernetes cluster with </w:t>
       </w:r>
       <w:hyperlink r:id="rId8">
         <w:r>
@@ -529,7 +529,7 @@
           <w:szCs w:val="24"/>
           <w:rtl w:val="0"/>
         </w:rPr>
-        <w:t xml:space="preserve">”, which will in turn monitor our Github project, specifically the above mentioned </w:t>
+        <w:t xml:space="preserve">”, which we will in turn tell to monitor our Github project, specifically the above mentioned </w:t>
       </w:r>
       <w:r>
         <w:rPr>
@@ -608,7 +608,7 @@
           <w:szCs w:val="24"/>
           <w:rtl w:val="0"/>
         </w:rPr>
-        <w:t xml:space="preserve"> onto our Kubernetes cluster hosted on </w:t>
+        <w:t xml:space="preserve"> onto our target Kubernetes cluster hosted on </w:t>
       </w:r>
       <w:hyperlink r:id="rId9">
         <w:r>
@@ -629,7 +629,7 @@
           <w:szCs w:val="24"/>
           <w:rtl w:val="0"/>
         </w:rPr>
-        <w:t xml:space="preserve">.</w:t>
+        <w:t xml:space="preserve"> stack.</w:t>
       </w:r>
       <w:r>
         <w:rPr>
@@ -668,7 +668,7 @@
           <w:szCs w:val="24"/>
           <w:rtl w:val="0"/>
         </w:rPr>
-        <w:t xml:space="preserve">:</w:t>
+        <w:t xml:space="preserve">: </w:t>
       </w:r>
       <w:hyperlink r:id="rId10">
         <w:r>
@@ -712,7 +712,7 @@
           <w:szCs w:val="24"/>
           <w:rtl w:val="0"/>
         </w:rPr>
-        <w:t xml:space="preserve"> the changes onto a destination cluster. For myself, working in the financial industry, and as we’re using Github Actions, which reside outside our network the pull is a more secure pattern.</w:t>
+        <w:t xml:space="preserve"> the changes onto a target cluster. For myself, working in the financial industry (we don’t trust easily), and as we’re using Github Actions, which reside outside our network the pull is a more secure pattern.</w:t>
       </w:r>
     </w:p>
     <w:p>
@@ -731,22 +731,29 @@
           <w:szCs w:val="24"/>
           <w:rtl w:val="0"/>
         </w:rPr>
-        <w:t xml:space="preserve">A Push pattern could very likely be preferred for application deployed in say AWS, where the ECR (Elastic Container Registry) and EKS (Elastic Kubernetes Cluster) is all hosted in a secured account.</w:t>
-      </w:r>
-    </w:p>
-    <w:p>
-      <w:pPr>
-        <w:spacing w:after="180" w:before="180" w:line="240" w:lineRule="auto"/>
+        <w:t xml:space="preserve">A </w:t>
+      </w:r>
+      <w:r>
+        <w:rPr>
+          <w:rFonts w:ascii="Cambria" w:cs="Cambria" w:eastAsia="Cambria" w:hAnsi="Cambria"/>
+          <w:b w:val="1"/>
+          <w:bCs w:val="1"/>
+          <w:i w:val="1"/>
+          <w:iCs w:val="1"/>
+          <w:sz w:val="24"/>
+          <w:szCs w:val="24"/>
+          <w:rtl w:val="0"/>
+        </w:rPr>
+        <w:t xml:space="preserve">“push”</w:t>
+      </w:r>
+      <w:r>
         <w:rPr>
           <w:rFonts w:ascii="Cambria" w:cs="Cambria" w:eastAsia="Cambria" w:hAnsi="Cambria"/>
           <w:sz w:val="24"/>
           <w:szCs w:val="24"/>
-        </w:rPr>
-      </w:pPr>
-      <w:r>
-        <w:rPr>
-          <w:rtl w:val="0"/>
-        </w:rPr>
+          <w:rtl w:val="0"/>
+        </w:rPr>
+        <w:t xml:space="preserve"> based pattern could very likely be preferred for application deployed in say AWS, where the ECR (Elastic Container Registry) and EKS (Elastic Kubernetes Cluster) is all hosted in a secured account.</w:t>
       </w:r>
     </w:p>
     <w:p>
@@ -760,20 +767,35 @@
       </w:pPr>
       <w:r>
         <w:rPr>
+          <w:rtl w:val="0"/>
+        </w:rPr>
+      </w:r>
+    </w:p>
+    <w:p>
+      <w:pPr>
+        <w:spacing w:after="180" w:before="180" w:line="240" w:lineRule="auto"/>
+        <w:rPr>
           <w:rFonts w:ascii="Cambria" w:cs="Cambria" w:eastAsia="Cambria" w:hAnsi="Cambria"/>
           <w:sz w:val="24"/>
           <w:szCs w:val="24"/>
         </w:rPr>
+      </w:pPr>
+      <w:r>
+        <w:rPr>
+          <w:rFonts w:ascii="Cambria" w:cs="Cambria" w:eastAsia="Cambria" w:hAnsi="Cambria"/>
+          <w:sz w:val="24"/>
+          <w:szCs w:val="24"/>
+        </w:rPr>
         <w:drawing>
           <wp:inline distB="114300" distT="114300" distL="114300" distR="114300">
-            <wp:extent cx="5943600" cy="2578100"/>
+            <wp:extent cx="5943600" cy="3200400"/>
             <wp:effectExtent b="0" l="0" r="0" t="0"/>
-            <wp:docPr id="14" name="image22.png"/>
+            <wp:docPr id="4" name="image1.png"/>
             <a:graphic>
               <a:graphicData uri="http://schemas.openxmlformats.org/drawingml/2006/picture">
                 <pic:pic>
                   <pic:nvPicPr>
-                    <pic:cNvPr id="0" name="image22.png"/>
+                    <pic:cNvPr id="0" name="image1.png"/>
                     <pic:cNvPicPr preferRelativeResize="0"/>
                   </pic:nvPicPr>
                   <pic:blipFill>
@@ -786,7 +808,7 @@
                   <pic:spPr>
                     <a:xfrm>
                       <a:off x="0" y="0"/>
-                      <a:ext cx="5943600" cy="2578100"/>
+                      <a:ext cx="5943600" cy="3200400"/>
                     </a:xfrm>
                     <a:prstGeom prst="rect"/>
                     <a:ln/>
@@ -829,27 +851,31 @@
       </w:pPr>
       <w:r>
         <w:rPr>
-          <w:rtl w:val="0"/>
-        </w:rPr>
-      </w:r>
-    </w:p>
-    <w:p>
-      <w:pPr>
-        <w:spacing w:after="180" w:before="180" w:line="240" w:lineRule="auto"/>
-        <w:rPr>
           <w:rFonts w:ascii="Cambria" w:cs="Cambria" w:eastAsia="Cambria" w:hAnsi="Cambria"/>
           <w:sz w:val="24"/>
           <w:szCs w:val="24"/>
-        </w:rPr>
-      </w:pPr>
-      <w:r>
+          <w:rtl w:val="0"/>
+        </w:rPr>
+        <w:t xml:space="preserve">What do we have here, as far as the developer is concerned;</w:t>
+      </w:r>
+    </w:p>
+    <w:p>
+      <w:pPr>
+        <w:spacing w:after="180" w:before="180" w:line="240" w:lineRule="auto"/>
         <w:rPr>
           <w:rFonts w:ascii="Cambria" w:cs="Cambria" w:eastAsia="Cambria" w:hAnsi="Cambria"/>
           <w:sz w:val="24"/>
           <w:szCs w:val="24"/>
-          <w:rtl w:val="0"/>
-        </w:rPr>
-        <w:t xml:space="preserve">No cloud account required. No VMs. Just Docker and a few commands and we have a fully functional Kubernetes development environment with an automated CI/CD deployment pipeline.</w:t>
+        </w:rPr>
+      </w:pPr>
+      <w:r>
+        <w:rPr>
+          <w:rFonts w:ascii="Cambria" w:cs="Cambria" w:eastAsia="Cambria" w:hAnsi="Cambria"/>
+          <w:sz w:val="24"/>
+          <w:szCs w:val="24"/>
+          <w:rtl w:val="0"/>
+        </w:rPr>
+        <w:t xml:space="preserve">No cloud account required. No VMs. Just Docker and a few commands and we have a fully functional Kubernetes development environment with an automated CI/CD deployment pipeline using ArgoCD, GitHub and a Docker repository.</w:t>
       </w:r>
     </w:p>
     <w:p>
@@ -1008,6 +1034,18 @@
           <w:rFonts w:ascii="Consolas" w:cs="Consolas" w:eastAsia="Consolas" w:hAnsi="Consolas"/>
         </w:rPr>
       </w:pPr>
+      <w:hyperlink r:id="rId15">
+        <w:r>
+          <w:rPr>
+            <w:rFonts w:ascii="Cambria" w:cs="Cambria" w:eastAsia="Cambria" w:hAnsi="Cambria"/>
+            <w:color w:val="4f81bd"/>
+            <w:sz w:val="24"/>
+            <w:szCs w:val="24"/>
+            <w:rtl w:val="0"/>
+          </w:rPr>
+          <w:t xml:space="preserve">vCluster</w:t>
+        </w:r>
+      </w:hyperlink>
       <w:r>
         <w:rPr>
           <w:rFonts w:ascii="Cambria" w:cs="Cambria" w:eastAsia="Cambria" w:hAnsi="Cambria"/>
@@ -1015,7 +1053,7 @@
           <w:szCs w:val="24"/>
           <w:rtl w:val="0"/>
         </w:rPr>
-        <w:t xml:space="preserve">vCluster with the Docker driver gives you a multi-node Kubernetes cluster running entirely in Docker containers. For this project, that means a control plane and three worker nodes  enough capacity to run the full observability stack alongside demo workloads  all created with a single command:</w:t>
+        <w:t xml:space="preserve"> with the Docker driver gives you a multi-node Kubernetes cluster running entirely in Docker containers. For this project, that means a control plane and three worker nodes  enough capacity to run the full observability stack alongside demo workloads  all created with a single command:</w:t>
       </w:r>
       <w:r>
         <w:rPr>
@@ -1682,7 +1720,7 @@
           <w:szCs w:val="28"/>
           <w:rtl w:val="0"/>
         </w:rPr>
-        <w:t xml:space="preserve">What We’re Deploying</w:t>
+        <w:t xml:space="preserve">What we will be deploying</w:t>
       </w:r>
     </w:p>
     <w:p>
@@ -2037,36 +2075,6 @@
         </w:tc>
       </w:tr>
     </w:tbl>
-    <w:p>
-      <w:pPr>
-        <w:rPr/>
-      </w:pPr>
-      <w:r>
-        <w:rPr>
-          <w:rtl w:val="0"/>
-        </w:rPr>
-      </w:r>
-    </w:p>
-    <w:p>
-      <w:pPr>
-        <w:rPr/>
-      </w:pPr>
-      <w:r>
-        <w:rPr>
-          <w:rtl w:val="0"/>
-        </w:rPr>
-      </w:r>
-    </w:p>
-    <w:p>
-      <w:pPr>
-        <w:rPr/>
-      </w:pPr>
-      <w:r>
-        <w:rPr>
-          <w:rtl w:val="0"/>
-        </w:rPr>
-      </w:r>
-    </w:p>
     <w:p>
       <w:pPr>
         <w:pStyle w:val="Heading2"/>
@@ -2748,7 +2756,7 @@
         <w:rPr>
           <w:rtl w:val="0"/>
         </w:rPr>
-        <w:t xml:space="preserve">Create </w:t>
+        <w:t xml:space="preserve">Create our </w:t>
       </w:r>
       <w:r>
         <w:rPr>
@@ -2800,7 +2808,7 @@
         <w:rPr>
           <w:rtl w:val="0"/>
         </w:rPr>
-        <w:t xml:space="preserve">Deploy ArgoCD stack onto Kubernetes Cluster</w:t>
+        <w:t xml:space="preserve">Deploy ArgoCD stack onto the Kubernetes Cluster</w:t>
       </w:r>
     </w:p>
     <w:p>
@@ -2880,6 +2888,24 @@
     </w:p>
     <w:p>
       <w:pPr>
+        <w:numPr>
+          <w:ilvl w:val="0"/>
+          <w:numId w:val="5"/>
+        </w:numPr>
+        <w:ind w:left="720" w:hanging="360"/>
+        <w:rPr>
+          <w:u w:val="none"/>
+        </w:rPr>
+      </w:pPr>
+      <w:r>
+        <w:rPr>
+          <w:rtl w:val="0"/>
+        </w:rPr>
+        <w:t xml:space="preserve">Resulting in an automated deployment by ArgoCD on our Kubernetes environment.</w:t>
+      </w:r>
+    </w:p>
+    <w:p>
+      <w:pPr>
         <w:spacing w:after="200" w:line="240" w:lineRule="auto"/>
         <w:rPr>
           <w:rFonts w:ascii="Consolas" w:cs="Consolas" w:eastAsia="Consolas" w:hAnsi="Consolas"/>
@@ -2909,7 +2935,7 @@
         </w:rPr>
         <w:t xml:space="preserve">For the complete step-by-step walkthrough, see </w:t>
       </w:r>
-      <w:hyperlink r:id="rId15">
+      <w:hyperlink r:id="rId16">
         <w:r>
           <w:rPr>
             <w:rFonts w:ascii="Consolas" w:cs="Consolas" w:eastAsia="Consolas" w:hAnsi="Consolas"/>
@@ -2927,7 +2953,7 @@
         </w:rPr>
         <w:t xml:space="preserve"> and </w:t>
       </w:r>
-      <w:hyperlink r:id="rId16">
+      <w:hyperlink r:id="rId17">
         <w:r>
           <w:rPr>
             <w:rFonts w:ascii="Consolas" w:cs="Consolas" w:eastAsia="Consolas" w:hAnsi="Consolas"/>
@@ -3009,7 +3035,7 @@
           <w:szCs w:val="24"/>
         </w:rPr>
       </w:pPr>
-      <w:hyperlink r:id="rId17">
+      <w:hyperlink r:id="rId18">
         <w:r>
           <w:rPr>
             <w:rFonts w:ascii="Cambria" w:cs="Cambria" w:eastAsia="Cambria" w:hAnsi="Cambria"/>
@@ -3047,7 +3073,7 @@
           <w:szCs w:val="24"/>
         </w:rPr>
       </w:pPr>
-      <w:hyperlink r:id="rId18">
+      <w:hyperlink r:id="rId19">
         <w:r>
           <w:rPr>
             <w:rFonts w:ascii="Cambria" w:cs="Cambria" w:eastAsia="Cambria" w:hAnsi="Cambria"/>
@@ -3085,7 +3111,7 @@
           <w:szCs w:val="24"/>
         </w:rPr>
       </w:pPr>
-      <w:hyperlink r:id="rId19">
+      <w:hyperlink r:id="rId20">
         <w:r>
           <w:rPr>
             <w:rFonts w:ascii="Cambria" w:cs="Cambria" w:eastAsia="Cambria" w:hAnsi="Cambria"/>
@@ -3123,7 +3149,7 @@
           <w:szCs w:val="24"/>
         </w:rPr>
       </w:pPr>
-      <w:hyperlink r:id="rId20">
+      <w:hyperlink r:id="rId21">
         <w:r>
           <w:rPr>
             <w:rFonts w:ascii="Cambria" w:cs="Cambria" w:eastAsia="Cambria" w:hAnsi="Cambria"/>
@@ -3172,7 +3198,7 @@
           <w:szCs w:val="24"/>
         </w:rPr>
       </w:pPr>
-      <w:hyperlink r:id="rId21">
+      <w:hyperlink r:id="rId22">
         <w:r>
           <w:rPr>
             <w:rFonts w:ascii="Cambria" w:cs="Cambria" w:eastAsia="Cambria" w:hAnsi="Cambria"/>
@@ -3206,124 +3232,6 @@
         </w:rPr>
         <w:t xml:space="preserve">— GitOps Pipeline configured using </w:t>
       </w:r>
-      <w:hyperlink r:id="rId22">
-        <w:r>
-          <w:rPr>
-            <w:rFonts w:ascii="Cambria" w:cs="Cambria" w:eastAsia="Cambria" w:hAnsi="Cambria"/>
-            <w:color w:val="1155cc"/>
-            <w:sz w:val="24"/>
-            <w:szCs w:val="24"/>
-            <w:u w:val="single"/>
-            <w:rtl w:val="0"/>
-          </w:rPr>
-          <w:t xml:space="preserve">ArgoCD</w:t>
-        </w:r>
-      </w:hyperlink>
-      <w:r>
-        <w:rPr>
-          <w:rtl w:val="0"/>
-        </w:rPr>
-      </w:r>
-    </w:p>
-    <w:p>
-      <w:pPr>
-        <w:spacing w:after="180" w:before="180" w:line="240" w:lineRule="auto"/>
-        <w:rPr>
-          <w:rFonts w:ascii="Cambria" w:cs="Cambria" w:eastAsia="Cambria" w:hAnsi="Cambria"/>
-          <w:sz w:val="24"/>
-          <w:szCs w:val="24"/>
-        </w:rPr>
-      </w:pPr>
-      <w:r>
-        <w:rPr>
-          <w:rFonts w:ascii="Cambria" w:cs="Cambria" w:eastAsia="Cambria" w:hAnsi="Cambria"/>
-          <w:sz w:val="24"/>
-          <w:szCs w:val="24"/>
-          <w:rtl w:val="0"/>
-        </w:rPr>
-        <w:t xml:space="preserve">By the end of the series, you have a local environment with application hosting, ingress routing, metrics collection, dashboarding, alerting, long-term metric storage, and log analytics. Now configured with an automated CI/CD pipeline root in Github.</w:t>
-      </w:r>
-    </w:p>
-    <w:p>
-      <w:pPr>
-        <w:spacing w:after="180" w:before="180" w:line="240" w:lineRule="auto"/>
-        <w:rPr>
-          <w:rFonts w:ascii="Cambria" w:cs="Cambria" w:eastAsia="Cambria" w:hAnsi="Cambria"/>
-          <w:sz w:val="24"/>
-          <w:szCs w:val="24"/>
-        </w:rPr>
-      </w:pPr>
-      <w:r>
-        <w:rPr>
-          <w:rFonts w:ascii="Cambria" w:cs="Cambria" w:eastAsia="Cambria" w:hAnsi="Cambria"/>
-          <w:sz w:val="24"/>
-          <w:szCs w:val="24"/>
-          <w:rtl w:val="0"/>
-        </w:rPr>
-        <w:t xml:space="preserve">That’s a genuinely useful development platform — and it all runs on your laptop.</w:t>
-      </w:r>
-    </w:p>
-    <w:p>
-      <w:pPr>
-        <w:spacing w:after="180" w:before="180" w:line="240" w:lineRule="auto"/>
-        <w:rPr>
-          <w:rFonts w:ascii="Cambria" w:cs="Cambria" w:eastAsia="Cambria" w:hAnsi="Cambria"/>
-          <w:sz w:val="24"/>
-          <w:szCs w:val="24"/>
-        </w:rPr>
-      </w:pPr>
-      <w:r>
-        <w:rPr>
-          <w:rtl w:val="0"/>
-        </w:rPr>
-      </w:r>
-    </w:p>
-    <w:p>
-      <w:pPr>
-        <w:pStyle w:val="Heading2"/>
-        <w:spacing w:after="0" w:before="200" w:line="240" w:lineRule="auto"/>
-        <w:rPr>
-          <w:rFonts w:ascii="Cambria" w:cs="Cambria" w:eastAsia="Cambria" w:hAnsi="Cambria"/>
-          <w:sz w:val="24"/>
-          <w:szCs w:val="24"/>
-        </w:rPr>
-      </w:pPr>
-      <w:bookmarkStart w:colFirst="0" w:colLast="0" w:name="_hnxumctriq4l" w:id="7"/>
-      <w:bookmarkEnd w:id="7"/>
-      <w:r>
-        <w:rPr>
-          <w:rFonts w:ascii="Calibri" w:cs="Calibri" w:eastAsia="Calibri" w:hAnsi="Calibri"/>
-          <w:b w:val="1"/>
-          <w:bCs w:val="1"/>
-          <w:color w:val="4f81bd"/>
-          <w:sz w:val="28"/>
-          <w:szCs w:val="28"/>
-          <w:rtl w:val="0"/>
-        </w:rPr>
-        <w:t xml:space="preserve">Deployment</w:t>
-      </w:r>
-      <w:bookmarkStart w:colFirst="0" w:colLast="0" w:name="kix.m8e26i30b9fn" w:id="6"/>
-      <w:bookmarkEnd w:id="6"/>
-      <w:r>
-        <w:rPr>
-          <w:rtl w:val="0"/>
-        </w:rPr>
-      </w:r>
-    </w:p>
-    <w:p>
-      <w:pPr>
-        <w:spacing w:after="180" w:before="180" w:line="240" w:lineRule="auto"/>
-        <w:rPr/>
-      </w:pPr>
-      <w:r>
-        <w:rPr>
-          <w:rFonts w:ascii="Cambria" w:cs="Cambria" w:eastAsia="Cambria" w:hAnsi="Cambria"/>
-          <w:sz w:val="24"/>
-          <w:szCs w:val="24"/>
-          <w:rtl w:val="0"/>
-        </w:rPr>
-        <w:t xml:space="preserve">The deployment has been divided into 2 sections, Core deployment which is our Kubernetes cluster (including </w:t>
-      </w:r>
       <w:hyperlink r:id="rId23">
         <w:r>
           <w:rPr>
@@ -3339,12 +3247,149 @@
       </w:hyperlink>
       <w:r>
         <w:rPr>
+          <w:rtl w:val="0"/>
+        </w:rPr>
+      </w:r>
+    </w:p>
+    <w:p>
+      <w:pPr>
+        <w:spacing w:after="180" w:before="180" w:line="240" w:lineRule="auto"/>
+        <w:rPr>
           <w:rFonts w:ascii="Cambria" w:cs="Cambria" w:eastAsia="Cambria" w:hAnsi="Cambria"/>
           <w:sz w:val="24"/>
           <w:szCs w:val="24"/>
-          <w:rtl w:val="0"/>
-        </w:rPr>
-        <w:t xml:space="preserve">) and the defining of our GitOps pipeline in Github using required yaml files as part of our project. Let’s get started.</w:t>
+        </w:rPr>
+      </w:pPr>
+      <w:r>
+        <w:rPr>
+          <w:rFonts w:ascii="Cambria" w:cs="Cambria" w:eastAsia="Cambria" w:hAnsi="Cambria"/>
+          <w:sz w:val="24"/>
+          <w:szCs w:val="24"/>
+          <w:rtl w:val="0"/>
+        </w:rPr>
+        <w:t xml:space="preserve">By the end of the series, you will have a local environment with application hosting, ingress routing, metrics collection, dashboarding, alerting, long-term metric storage, and log analytics.Configured with an automated CI/CD pipeline rooted using Github Actions.</w:t>
+      </w:r>
+    </w:p>
+    <w:p>
+      <w:pPr>
+        <w:spacing w:after="180" w:before="180" w:line="240" w:lineRule="auto"/>
+        <w:rPr>
+          <w:rFonts w:ascii="Cambria" w:cs="Cambria" w:eastAsia="Cambria" w:hAnsi="Cambria"/>
+          <w:sz w:val="24"/>
+          <w:szCs w:val="24"/>
+        </w:rPr>
+      </w:pPr>
+      <w:r>
+        <w:rPr>
+          <w:rFonts w:ascii="Cambria" w:cs="Cambria" w:eastAsia="Cambria" w:hAnsi="Cambria"/>
+          <w:sz w:val="24"/>
+          <w:szCs w:val="24"/>
+          <w:rtl w:val="0"/>
+        </w:rPr>
+        <w:t xml:space="preserve">That’s a genuinely useful development platform — and it all runs on your laptop.</w:t>
+      </w:r>
+    </w:p>
+    <w:p>
+      <w:pPr>
+        <w:spacing w:after="180" w:before="180" w:line="240" w:lineRule="auto"/>
+        <w:rPr>
+          <w:rFonts w:ascii="Cambria" w:cs="Cambria" w:eastAsia="Cambria" w:hAnsi="Cambria"/>
+          <w:sz w:val="24"/>
+          <w:szCs w:val="24"/>
+        </w:rPr>
+      </w:pPr>
+      <w:r>
+        <w:rPr>
+          <w:rtl w:val="0"/>
+        </w:rPr>
+      </w:r>
+    </w:p>
+    <w:p>
+      <w:pPr>
+        <w:pStyle w:val="Heading2"/>
+        <w:spacing w:after="0" w:before="200" w:line="240" w:lineRule="auto"/>
+        <w:rPr>
+          <w:rFonts w:ascii="Cambria" w:cs="Cambria" w:eastAsia="Cambria" w:hAnsi="Cambria"/>
+          <w:sz w:val="24"/>
+          <w:szCs w:val="24"/>
+        </w:rPr>
+      </w:pPr>
+      <w:bookmarkStart w:colFirst="0" w:colLast="0" w:name="_hnxumctriq4l" w:id="7"/>
+      <w:bookmarkEnd w:id="7"/>
+      <w:r>
+        <w:rPr>
+          <w:rFonts w:ascii="Calibri" w:cs="Calibri" w:eastAsia="Calibri" w:hAnsi="Calibri"/>
+          <w:b w:val="1"/>
+          <w:bCs w:val="1"/>
+          <w:color w:val="4f81bd"/>
+          <w:sz w:val="28"/>
+          <w:szCs w:val="28"/>
+          <w:rtl w:val="0"/>
+        </w:rPr>
+        <w:t xml:space="preserve">Deployment</w:t>
+      </w:r>
+      <w:bookmarkStart w:colFirst="0" w:colLast="0" w:name="kix.m8e26i30b9fn" w:id="6"/>
+      <w:bookmarkEnd w:id="6"/>
+      <w:r>
+        <w:rPr>
+          <w:rtl w:val="0"/>
+        </w:rPr>
+      </w:r>
+    </w:p>
+    <w:p>
+      <w:pPr>
+        <w:spacing w:after="180" w:before="180" w:line="240" w:lineRule="auto"/>
+        <w:rPr>
+          <w:rFonts w:ascii="Cambria" w:cs="Cambria" w:eastAsia="Cambria" w:hAnsi="Cambria"/>
+          <w:sz w:val="24"/>
+          <w:szCs w:val="24"/>
+        </w:rPr>
+      </w:pPr>
+      <w:r>
+        <w:rPr>
+          <w:rFonts w:ascii="Cambria" w:cs="Cambria" w:eastAsia="Cambria" w:hAnsi="Cambria"/>
+          <w:sz w:val="24"/>
+          <w:szCs w:val="24"/>
+          <w:rtl w:val="0"/>
+        </w:rPr>
+        <w:t xml:space="preserve">The deployment has been divided into 2 sections, first, the core deployment which is our Kubernetes cluster (including </w:t>
+      </w:r>
+      <w:hyperlink r:id="rId24">
+        <w:r>
+          <w:rPr>
+            <w:rFonts w:ascii="Cambria" w:cs="Cambria" w:eastAsia="Cambria" w:hAnsi="Cambria"/>
+            <w:color w:val="1155cc"/>
+            <w:sz w:val="24"/>
+            <w:szCs w:val="24"/>
+            <w:u w:val="single"/>
+            <w:rtl w:val="0"/>
+          </w:rPr>
+          <w:t xml:space="preserve">ArgoCD</w:t>
+        </w:r>
+      </w:hyperlink>
+      <w:r>
+        <w:rPr>
+          <w:rFonts w:ascii="Cambria" w:cs="Cambria" w:eastAsia="Cambria" w:hAnsi="Cambria"/>
+          <w:sz w:val="24"/>
+          <w:szCs w:val="24"/>
+          <w:rtl w:val="0"/>
+        </w:rPr>
+        <w:t xml:space="preserve">) and secondly our GitOps pipeline rooted in Github provided with the various required yaml files as part of our project repo. </w:t>
+      </w:r>
+    </w:p>
+    <w:p>
+      <w:pPr>
+        <w:spacing w:after="180" w:before="180" w:line="240" w:lineRule="auto"/>
+        <w:rPr/>
+      </w:pPr>
+      <w:r>
+        <w:rPr>
+          <w:rFonts w:ascii="Cambria" w:cs="Cambria" w:eastAsia="Cambria" w:hAnsi="Cambria"/>
+          <w:sz w:val="24"/>
+          <w:szCs w:val="24"/>
+          <w:rtl w:val="0"/>
+        </w:rPr>
+        <w:t xml:space="preserve">So let’s get started.</w:t>
       </w:r>
       <w:r>
         <w:rPr>
@@ -3358,22 +3403,8 @@
         <w:spacing w:after="0" w:before="200" w:line="240" w:lineRule="auto"/>
         <w:rPr/>
       </w:pPr>
-      <w:bookmarkStart w:colFirst="0" w:colLast="0" w:name="_ouwzylzcq58u" w:id="8"/>
+      <w:bookmarkStart w:colFirst="0" w:colLast="0" w:name="_r6037wgeabgz" w:id="8"/>
       <w:bookmarkEnd w:id="8"/>
-      <w:r>
-        <w:rPr>
-          <w:rtl w:val="0"/>
-        </w:rPr>
-      </w:r>
-    </w:p>
-    <w:p>
-      <w:pPr>
-        <w:pStyle w:val="Heading3"/>
-        <w:spacing w:after="0" w:before="200" w:line="240" w:lineRule="auto"/>
-        <w:rPr/>
-      </w:pPr>
-      <w:bookmarkStart w:colFirst="0" w:colLast="0" w:name="_r6037wgeabgz" w:id="9"/>
-      <w:bookmarkEnd w:id="9"/>
       <w:r>
         <w:rPr>
           <w:rtl w:val="0"/>
@@ -3587,7 +3618,7 @@
         </w:rPr>
         <w:t xml:space="preserve">The below steps/screenshots are basically our output from the steps as per </w:t>
       </w:r>
-      <w:hyperlink r:id="rId24">
+      <w:hyperlink r:id="rId25">
         <w:r>
           <w:rPr>
             <w:color w:val="1155cc"/>
@@ -3709,7 +3740,7 @@
                     <pic:cNvPicPr preferRelativeResize="0"/>
                   </pic:nvPicPr>
                   <pic:blipFill>
-                    <a:blip r:embed="rId25"/>
+                    <a:blip r:embed="rId26"/>
                     <a:srcRect b="0" l="0" r="0" t="0"/>
                     <a:stretch>
                       <a:fillRect/>
@@ -3842,6 +3873,39 @@
         </w:rPr>
       </w:r>
     </w:p>
+    <w:p>
+      <w:pPr>
+        <w:keepNext w:val="0"/>
+        <w:keepLines w:val="0"/>
+        <w:pageBreakBefore w:val="0"/>
+        <w:widowControl w:val="0"/>
+        <w:pBdr>
+          <w:top w:space="0" w:sz="0" w:val="nil"/>
+          <w:left w:space="0" w:sz="0" w:val="nil"/>
+          <w:bottom w:space="0" w:sz="0" w:val="nil"/>
+          <w:right w:space="0" w:sz="0" w:val="nil"/>
+          <w:between w:space="0" w:sz="0" w:val="nil"/>
+        </w:pBdr>
+        <w:shd w:fill="auto" w:val="clear"/>
+        <w:spacing w:after="0" w:before="0" w:line="276" w:lineRule="auto"/>
+        <w:ind w:left="0" w:right="0" w:firstLine="0"/>
+        <w:jc w:val="left"/>
+        <w:rPr>
+          <w:rFonts w:ascii="Courier New" w:cs="Courier New" w:eastAsia="Courier New" w:hAnsi="Courier New"/>
+          <w:b w:val="1"/>
+          <w:bCs w:val="1"/>
+        </w:rPr>
+      </w:pPr>
+      <w:r>
+        <w:rPr>
+          <w:rFonts w:ascii="Courier New" w:cs="Courier New" w:eastAsia="Courier New" w:hAnsi="Courier New"/>
+          <w:b w:val="1"/>
+          <w:bCs w:val="1"/>
+          <w:rtl w:val="0"/>
+        </w:rPr>
+        <w:t xml:space="preserve">mycluster.yml</w:t>
+      </w:r>
+    </w:p>
     <w:tbl>
       <w:tblPr>
         <w:tblStyle w:val="Table7"/>
@@ -4454,16 +4518,16 @@
           <wp:inline distB="114300" distT="114300" distL="114300" distR="114300">
             <wp:extent cx="5943600" cy="1460500"/>
             <wp:effectExtent b="0" l="0" r="0" t="0"/>
-            <wp:docPr id="7" name="image20.png"/>
+            <wp:docPr id="8" name="image13.png"/>
             <a:graphic>
               <a:graphicData uri="http://schemas.openxmlformats.org/drawingml/2006/picture">
                 <pic:pic>
                   <pic:nvPicPr>
-                    <pic:cNvPr id="0" name="image20.png"/>
+                    <pic:cNvPr id="0" name="image13.png"/>
                     <pic:cNvPicPr preferRelativeResize="0"/>
                   </pic:nvPicPr>
                   <pic:blipFill>
-                    <a:blip r:embed="rId26"/>
+                    <a:blip r:embed="rId27"/>
                     <a:srcRect b="0" l="0" r="0" t="0"/>
                     <a:stretch>
                       <a:fillRect/>
@@ -4615,16 +4679,16 @@
           <wp:inline distB="114300" distT="114300" distL="114300" distR="114300">
             <wp:extent cx="5943600" cy="584200"/>
             <wp:effectExtent b="0" l="0" r="0" t="0"/>
-            <wp:docPr id="15" name="image12.png"/>
+            <wp:docPr id="15" name="image10.png"/>
             <a:graphic>
               <a:graphicData uri="http://schemas.openxmlformats.org/drawingml/2006/picture">
                 <pic:pic>
                   <pic:nvPicPr>
-                    <pic:cNvPr id="0" name="image12.png"/>
+                    <pic:cNvPr id="0" name="image10.png"/>
                     <pic:cNvPicPr preferRelativeResize="0"/>
                   </pic:nvPicPr>
                   <pic:blipFill>
-                    <a:blip r:embed="rId27"/>
+                    <a:blip r:embed="rId28"/>
                     <a:srcRect b="0" l="0" r="0" t="0"/>
                     <a:stretch>
                       <a:fillRect/>
@@ -4748,16 +4812,16 @@
           <wp:inline distB="114300" distT="114300" distL="114300" distR="114300">
             <wp:extent cx="5943600" cy="1206500"/>
             <wp:effectExtent b="0" l="0" r="0" t="0"/>
-            <wp:docPr id="11" name="image6.png"/>
+            <wp:docPr id="12" name="image4.png"/>
             <a:graphic>
               <a:graphicData uri="http://schemas.openxmlformats.org/drawingml/2006/picture">
                 <pic:pic>
                   <pic:nvPicPr>
-                    <pic:cNvPr id="0" name="image6.png"/>
+                    <pic:cNvPr id="0" name="image4.png"/>
                     <pic:cNvPicPr preferRelativeResize="0"/>
                   </pic:nvPicPr>
                   <pic:blipFill>
-                    <a:blip r:embed="rId28"/>
+                    <a:blip r:embed="rId29"/>
                     <a:srcRect b="0" l="0" r="0" t="0"/>
                     <a:stretch>
                       <a:fillRect/>
@@ -4785,11 +4849,26 @@
     </w:p>
     <w:p>
       <w:pPr>
-        <w:spacing w:after="0" w:before="200" w:line="240" w:lineRule="auto"/>
+        <w:rPr/>
+      </w:pPr>
+      <w:r>
+        <w:rPr>
+          <w:rtl w:val="0"/>
+        </w:rPr>
+      </w:r>
+    </w:p>
+    <w:p>
+      <w:pPr>
         <w:rPr>
           <w:rFonts w:ascii="Courier New" w:cs="Courier New" w:eastAsia="Courier New" w:hAnsi="Courier New"/>
         </w:rPr>
       </w:pPr>
+      <w:r>
+        <w:rPr>
+          <w:rtl w:val="0"/>
+        </w:rPr>
+        <w:t xml:space="preserve">Lets label our nodes correctly.</w:t>
+      </w:r>
       <w:r>
         <w:rPr>
           <w:rtl w:val="0"/>
@@ -4829,21 +4908,7 @@
           </w:tcPr>
           <w:p>
             <w:pPr>
-              <w:keepNext w:val="0"/>
-              <w:keepLines w:val="0"/>
-              <w:pageBreakBefore w:val="0"/>
               <w:widowControl w:val="0"/>
-              <w:pBdr>
-                <w:top w:space="0" w:sz="0" w:val="nil"/>
-                <w:left w:space="0" w:sz="0" w:val="nil"/>
-                <w:bottom w:space="0" w:sz="0" w:val="nil"/>
-                <w:right w:space="0" w:sz="0" w:val="nil"/>
-                <w:between w:space="0" w:sz="0" w:val="nil"/>
-              </w:pBdr>
-              <w:shd w:fill="auto" w:val="clear"/>
-              <w:spacing w:after="0" w:before="0" w:line="276" w:lineRule="auto"/>
-              <w:ind w:left="0" w:right="0" w:firstLine="0"/>
-              <w:jc w:val="left"/>
               <w:rPr>
                 <w:rFonts w:ascii="Courier New" w:cs="Courier New" w:eastAsia="Courier New" w:hAnsi="Courier New"/>
               </w:rPr>
@@ -4855,7 +4920,7 @@
                 <w:shd w:fill="333333" w:val="clear"/>
                 <w:rtl w:val="0"/>
               </w:rPr>
-              <w:t xml:space="preserve">kubectl get namespaces</w:t>
+              <w:t xml:space="preserve">kubectl label node worker-1 worker-2 worker-3 node-role.kubernetes.io/worker=worker</w:t>
             </w:r>
             <w:r>
               <w:rPr>
@@ -4868,7 +4933,17 @@
     </w:tbl>
     <w:p>
       <w:pPr>
-        <w:spacing w:after="0" w:before="200" w:line="240" w:lineRule="auto"/>
+        <w:rPr/>
+      </w:pPr>
+      <w:r>
+        <w:rPr>
+          <w:rtl w:val="0"/>
+        </w:rPr>
+      </w:r>
+    </w:p>
+    <w:p>
+      <w:pPr>
+        <w:spacing w:before="200" w:line="240" w:lineRule="auto"/>
         <w:rPr>
           <w:rFonts w:ascii="Courier New" w:cs="Courier New" w:eastAsia="Courier New" w:hAnsi="Courier New"/>
         </w:rPr>
@@ -4879,18 +4954,18 @@
         </w:rPr>
         <w:drawing>
           <wp:inline distB="114300" distT="114300" distL="114300" distR="114300">
-            <wp:extent cx="5943600" cy="1397000"/>
+            <wp:extent cx="5943600" cy="901700"/>
             <wp:effectExtent b="0" l="0" r="0" t="0"/>
-            <wp:docPr id="9" name="image8.png"/>
+            <wp:docPr id="13" name="image15.png"/>
             <a:graphic>
               <a:graphicData uri="http://schemas.openxmlformats.org/drawingml/2006/picture">
                 <pic:pic>
                   <pic:nvPicPr>
-                    <pic:cNvPr id="0" name="image8.png"/>
+                    <pic:cNvPr id="0" name="image15.png"/>
                     <pic:cNvPicPr preferRelativeResize="0"/>
                   </pic:nvPicPr>
                   <pic:blipFill>
-                    <a:blip r:embed="rId29"/>
+                    <a:blip r:embed="rId30"/>
                     <a:srcRect b="0" l="0" r="0" t="0"/>
                     <a:stretch>
                       <a:fillRect/>
@@ -4899,7 +4974,7 @@
                   <pic:spPr>
                     <a:xfrm>
                       <a:off x="0" y="0"/>
-                      <a:ext cx="5943600" cy="1397000"/>
+                      <a:ext cx="5943600" cy="901700"/>
                     </a:xfrm>
                     <a:prstGeom prst="rect"/>
                     <a:ln/>
@@ -4918,26 +4993,11 @@
     </w:p>
     <w:p>
       <w:pPr>
-        <w:rPr/>
-      </w:pPr>
-      <w:r>
-        <w:rPr>
-          <w:rtl w:val="0"/>
-        </w:rPr>
-      </w:r>
-    </w:p>
-    <w:p>
-      <w:pPr>
+        <w:spacing w:before="200" w:line="240" w:lineRule="auto"/>
         <w:rPr>
           <w:rFonts w:ascii="Courier New" w:cs="Courier New" w:eastAsia="Courier New" w:hAnsi="Courier New"/>
         </w:rPr>
       </w:pPr>
-      <w:r>
-        <w:rPr>
-          <w:rtl w:val="0"/>
-        </w:rPr>
-        <w:t xml:space="preserve">Lets quickly create our 2 namespaces that will be utilised.</w:t>
-      </w:r>
       <w:r>
         <w:rPr>
           <w:rtl w:val="0"/>
@@ -4979,83 +5039,22 @@
             <w:pPr>
               <w:widowControl w:val="0"/>
               <w:rPr>
-                <w:rFonts w:ascii="Consolas" w:cs="Consolas" w:eastAsia="Consolas" w:hAnsi="Consolas"/>
-                <w:color w:val="ffffff"/>
-                <w:sz w:val="18"/>
-                <w:szCs w:val="18"/>
-                <w:shd w:fill="333333" w:val="clear"/>
+                <w:rFonts w:ascii="Courier New" w:cs="Courier New" w:eastAsia="Courier New" w:hAnsi="Courier New"/>
               </w:rPr>
             </w:pPr>
             <w:r>
               <w:rPr>
                 <w:rFonts w:ascii="Consolas" w:cs="Consolas" w:eastAsia="Consolas" w:hAnsi="Consolas"/>
                 <w:color w:val="ffffff"/>
-                <w:sz w:val="18"/>
-                <w:szCs w:val="18"/>
-                <w:shd w:fill="333333" w:val="clear"/>
-                <w:rtl w:val="0"/>
-              </w:rPr>
-              <w:t xml:space="preserve">cat &lt;&lt;EOF | kubectl apply -f -</w:t>
-              <w:br w:type="textWrapping"/>
-              <w:t xml:space="preserve">apiVersion: v1</w:t>
-              <w:br w:type="textWrapping"/>
-              <w:t xml:space="preserve">kind: Namespace</w:t>
-              <w:br w:type="textWrapping"/>
-              <w:t xml:space="preserve">metadata:</w:t>
-              <w:br w:type="textWrapping"/>
-              <w:t xml:space="preserve"> name: app</w:t>
-              <w:br w:type="textWrapping"/>
-              <w:t xml:space="preserve">EOF</w:t>
-            </w:r>
-          </w:p>
-          <w:p>
-            <w:pPr>
-              <w:widowControl w:val="0"/>
-              <w:rPr>
-                <w:rFonts w:ascii="Consolas" w:cs="Consolas" w:eastAsia="Consolas" w:hAnsi="Consolas"/>
-                <w:color w:val="ffffff"/>
-                <w:sz w:val="18"/>
-                <w:szCs w:val="18"/>
-                <w:shd w:fill="333333" w:val="clear"/>
-              </w:rPr>
-            </w:pPr>
-            <w:r>
-              <w:rPr>
-                <w:rtl w:val="0"/>
-              </w:rPr>
-            </w:r>
-          </w:p>
-          <w:p>
-            <w:pPr>
-              <w:widowControl w:val="0"/>
-              <w:rPr>
-                <w:rFonts w:ascii="Consolas" w:cs="Consolas" w:eastAsia="Consolas" w:hAnsi="Consolas"/>
-                <w:color w:val="ffffff"/>
-                <w:sz w:val="18"/>
-                <w:szCs w:val="18"/>
-                <w:shd w:fill="333333" w:val="clear"/>
-              </w:rPr>
-            </w:pPr>
-            <w:r>
-              <w:rPr>
-                <w:rFonts w:ascii="Consolas" w:cs="Consolas" w:eastAsia="Consolas" w:hAnsi="Consolas"/>
-                <w:color w:val="ffffff"/>
-                <w:sz w:val="18"/>
-                <w:szCs w:val="18"/>
-                <w:shd w:fill="333333" w:val="clear"/>
-                <w:rtl w:val="0"/>
-              </w:rPr>
-              <w:t xml:space="preserve">cat &lt;&lt;EOF | kubectl apply -f -</w:t>
-              <w:br w:type="textWrapping"/>
-              <w:t xml:space="preserve">apiVersion: v1</w:t>
-              <w:br w:type="textWrapping"/>
-              <w:t xml:space="preserve">kind: Namespace</w:t>
-              <w:br w:type="textWrapping"/>
-              <w:t xml:space="preserve">metadata:</w:t>
-              <w:br w:type="textWrapping"/>
-              <w:t xml:space="preserve"> name: argocd</w:t>
-              <w:br w:type="textWrapping"/>
-              <w:t xml:space="preserve">EOF</w:t>
+                <w:shd w:fill="333333" w:val="clear"/>
+                <w:rtl w:val="0"/>
+              </w:rPr>
+              <w:t xml:space="preserve">kubectl get nodes</w:t>
+            </w:r>
+            <w:r>
+              <w:rPr>
+                <w:rtl w:val="0"/>
+              </w:rPr>
             </w:r>
           </w:p>
         </w:tc>
@@ -5074,18 +5073,18 @@
         </w:rPr>
         <w:drawing>
           <wp:inline distB="114300" distT="114300" distL="114300" distR="114300">
-            <wp:extent cx="5943600" cy="1714500"/>
+            <wp:extent cx="5943600" cy="1155700"/>
             <wp:effectExtent b="0" l="0" r="0" t="0"/>
-            <wp:docPr id="3" name="image16.png"/>
+            <wp:docPr id="9" name="image9.png"/>
             <a:graphic>
               <a:graphicData uri="http://schemas.openxmlformats.org/drawingml/2006/picture">
                 <pic:pic>
                   <pic:nvPicPr>
-                    <pic:cNvPr id="0" name="image16.png"/>
+                    <pic:cNvPr id="0" name="image9.png"/>
                     <pic:cNvPicPr preferRelativeResize="0"/>
                   </pic:nvPicPr>
                   <pic:blipFill>
-                    <a:blip r:embed="rId30"/>
+                    <a:blip r:embed="rId31"/>
                     <a:srcRect b="0" l="0" r="0" t="0"/>
                     <a:stretch>
                       <a:fillRect/>
@@ -5094,7 +5093,7 @@
                   <pic:spPr>
                     <a:xfrm>
                       <a:off x="0" y="0"/>
-                      <a:ext cx="5943600" cy="1714500"/>
+                      <a:ext cx="5943600" cy="1155700"/>
                     </a:xfrm>
                     <a:prstGeom prst="rect"/>
                     <a:ln/>
@@ -5183,7 +5182,7 @@
                 <w:shd w:fill="333333" w:val="clear"/>
                 <w:rtl w:val="0"/>
               </w:rPr>
-              <w:t xml:space="preserve">kubectl label node worker-1 worker-2 worker-3 node-role.kubernetes.io/worker=worker</w:t>
+              <w:t xml:space="preserve">kubectl get namespaces</w:t>
             </w:r>
             <w:r>
               <w:rPr>
@@ -5196,29 +5195,44 @@
     </w:tbl>
     <w:p>
       <w:pPr>
-        <w:spacing w:before="200" w:line="240" w:lineRule="auto"/>
+        <w:rPr/>
+      </w:pPr>
+      <w:r>
+        <w:rPr>
+          <w:rtl w:val="0"/>
+        </w:rPr>
+      </w:r>
+    </w:p>
+    <w:p>
+      <w:pPr>
         <w:rPr>
           <w:rFonts w:ascii="Courier New" w:cs="Courier New" w:eastAsia="Courier New" w:hAnsi="Courier New"/>
         </w:rPr>
       </w:pPr>
+      <w:r>
+        <w:rPr>
+          <w:rtl w:val="0"/>
+        </w:rPr>
+        <w:t xml:space="preserve">Our base/default namespaces</w:t>
+      </w:r>
       <w:r>
         <w:rPr>
           <w:rFonts w:ascii="Courier New" w:cs="Courier New" w:eastAsia="Courier New" w:hAnsi="Courier New"/>
         </w:rPr>
         <w:drawing>
           <wp:inline distB="114300" distT="114300" distL="114300" distR="114300">
-            <wp:extent cx="5943600" cy="901700"/>
+            <wp:extent cx="5943600" cy="1397000"/>
             <wp:effectExtent b="0" l="0" r="0" t="0"/>
-            <wp:docPr id="8" name="image10.png"/>
+            <wp:docPr id="10" name="image16.png"/>
             <a:graphic>
               <a:graphicData uri="http://schemas.openxmlformats.org/drawingml/2006/picture">
                 <pic:pic>
                   <pic:nvPicPr>
-                    <pic:cNvPr id="0" name="image10.png"/>
+                    <pic:cNvPr id="0" name="image16.png"/>
                     <pic:cNvPicPr preferRelativeResize="0"/>
                   </pic:nvPicPr>
                   <pic:blipFill>
-                    <a:blip r:embed="rId31"/>
+                    <a:blip r:embed="rId32"/>
                     <a:srcRect b="0" l="0" r="0" t="0"/>
                     <a:stretch>
                       <a:fillRect/>
@@ -5227,7 +5241,7 @@
                   <pic:spPr>
                     <a:xfrm>
                       <a:off x="0" y="0"/>
-                      <a:ext cx="5943600" cy="901700"/>
+                      <a:ext cx="5943600" cy="1397000"/>
                     </a:xfrm>
                     <a:prstGeom prst="rect"/>
                     <a:ln/>
@@ -5246,11 +5260,26 @@
     </w:p>
     <w:p>
       <w:pPr>
-        <w:spacing w:before="200" w:line="240" w:lineRule="auto"/>
+        <w:rPr/>
+      </w:pPr>
+      <w:r>
+        <w:rPr>
+          <w:rtl w:val="0"/>
+        </w:rPr>
+      </w:r>
+    </w:p>
+    <w:p>
+      <w:pPr>
         <w:rPr>
           <w:rFonts w:ascii="Courier New" w:cs="Courier New" w:eastAsia="Courier New" w:hAnsi="Courier New"/>
         </w:rPr>
       </w:pPr>
+      <w:r>
+        <w:rPr>
+          <w:rtl w:val="0"/>
+        </w:rPr>
+        <w:t xml:space="preserve">Lets quickly create our 2 namespaces that will be utilised.</w:t>
+      </w:r>
       <w:r>
         <w:rPr>
           <w:rtl w:val="0"/>
@@ -5290,38 +5319,85 @@
           </w:tcPr>
           <w:p>
             <w:pPr>
-              <w:keepNext w:val="0"/>
-              <w:keepLines w:val="0"/>
-              <w:pageBreakBefore w:val="0"/>
               <w:widowControl w:val="0"/>
-              <w:pBdr>
-                <w:top w:space="0" w:sz="0" w:val="nil"/>
-                <w:left w:space="0" w:sz="0" w:val="nil"/>
-                <w:bottom w:space="0" w:sz="0" w:val="nil"/>
-                <w:right w:space="0" w:sz="0" w:val="nil"/>
-                <w:between w:space="0" w:sz="0" w:val="nil"/>
-              </w:pBdr>
-              <w:shd w:fill="auto" w:val="clear"/>
-              <w:spacing w:after="0" w:before="0" w:line="276" w:lineRule="auto"/>
-              <w:ind w:left="0" w:right="0" w:firstLine="0"/>
-              <w:jc w:val="left"/>
-              <w:rPr>
-                <w:rFonts w:ascii="Courier New" w:cs="Courier New" w:eastAsia="Courier New" w:hAnsi="Courier New"/>
+              <w:rPr>
+                <w:rFonts w:ascii="Consolas" w:cs="Consolas" w:eastAsia="Consolas" w:hAnsi="Consolas"/>
+                <w:color w:val="ffffff"/>
+                <w:sz w:val="18"/>
+                <w:szCs w:val="18"/>
+                <w:shd w:fill="333333" w:val="clear"/>
               </w:rPr>
             </w:pPr>
             <w:r>
               <w:rPr>
                 <w:rFonts w:ascii="Consolas" w:cs="Consolas" w:eastAsia="Consolas" w:hAnsi="Consolas"/>
                 <w:color w:val="ffffff"/>
-                <w:shd w:fill="333333" w:val="clear"/>
-                <w:rtl w:val="0"/>
-              </w:rPr>
-              <w:t xml:space="preserve">kubectl get nodes</w:t>
-            </w:r>
-            <w:r>
-              <w:rPr>
-                <w:rtl w:val="0"/>
-              </w:rPr>
+                <w:sz w:val="18"/>
+                <w:szCs w:val="18"/>
+                <w:shd w:fill="333333" w:val="clear"/>
+                <w:rtl w:val="0"/>
+              </w:rPr>
+              <w:t xml:space="preserve">cat &lt;&lt;EOF | kubectl apply -f -</w:t>
+              <w:br w:type="textWrapping"/>
+              <w:t xml:space="preserve">apiVersion: v1</w:t>
+              <w:br w:type="textWrapping"/>
+              <w:t xml:space="preserve">kind: Namespace</w:t>
+              <w:br w:type="textWrapping"/>
+              <w:t xml:space="preserve">metadata:</w:t>
+              <w:br w:type="textWrapping"/>
+              <w:t xml:space="preserve"> name: app</w:t>
+              <w:br w:type="textWrapping"/>
+              <w:t xml:space="preserve">EOF</w:t>
+            </w:r>
+          </w:p>
+          <w:p>
+            <w:pPr>
+              <w:widowControl w:val="0"/>
+              <w:rPr>
+                <w:rFonts w:ascii="Consolas" w:cs="Consolas" w:eastAsia="Consolas" w:hAnsi="Consolas"/>
+                <w:color w:val="ffffff"/>
+                <w:sz w:val="18"/>
+                <w:szCs w:val="18"/>
+                <w:shd w:fill="333333" w:val="clear"/>
+              </w:rPr>
+            </w:pPr>
+            <w:r>
+              <w:rPr>
+                <w:rtl w:val="0"/>
+              </w:rPr>
+            </w:r>
+          </w:p>
+          <w:p>
+            <w:pPr>
+              <w:widowControl w:val="0"/>
+              <w:rPr>
+                <w:rFonts w:ascii="Consolas" w:cs="Consolas" w:eastAsia="Consolas" w:hAnsi="Consolas"/>
+                <w:color w:val="ffffff"/>
+                <w:sz w:val="18"/>
+                <w:szCs w:val="18"/>
+                <w:shd w:fill="333333" w:val="clear"/>
+              </w:rPr>
+            </w:pPr>
+            <w:r>
+              <w:rPr>
+                <w:rFonts w:ascii="Consolas" w:cs="Consolas" w:eastAsia="Consolas" w:hAnsi="Consolas"/>
+                <w:color w:val="ffffff"/>
+                <w:sz w:val="18"/>
+                <w:szCs w:val="18"/>
+                <w:shd w:fill="333333" w:val="clear"/>
+                <w:rtl w:val="0"/>
+              </w:rPr>
+              <w:t xml:space="preserve">cat &lt;&lt;EOF | kubectl apply -f -</w:t>
+              <w:br w:type="textWrapping"/>
+              <w:t xml:space="preserve">apiVersion: v1</w:t>
+              <w:br w:type="textWrapping"/>
+              <w:t xml:space="preserve">kind: Namespace</w:t>
+              <w:br w:type="textWrapping"/>
+              <w:t xml:space="preserve">metadata:</w:t>
+              <w:br w:type="textWrapping"/>
+              <w:t xml:space="preserve"> name: argocd</w:t>
+              <w:br w:type="textWrapping"/>
+              <w:t xml:space="preserve">EOF</w:t>
             </w:r>
           </w:p>
         </w:tc>
@@ -5340,18 +5416,18 @@
         </w:rPr>
         <w:drawing>
           <wp:inline distB="114300" distT="114300" distL="114300" distR="114300">
-            <wp:extent cx="5943600" cy="1155700"/>
+            <wp:extent cx="5943600" cy="1714500"/>
             <wp:effectExtent b="0" l="0" r="0" t="0"/>
-            <wp:docPr id="12" name="image13.png"/>
+            <wp:docPr id="3" name="image6.png"/>
             <a:graphic>
               <a:graphicData uri="http://schemas.openxmlformats.org/drawingml/2006/picture">
                 <pic:pic>
                   <pic:nvPicPr>
-                    <pic:cNvPr id="0" name="image13.png"/>
+                    <pic:cNvPr id="0" name="image6.png"/>
                     <pic:cNvPicPr preferRelativeResize="0"/>
                   </pic:nvPicPr>
                   <pic:blipFill>
-                    <a:blip r:embed="rId32"/>
+                    <a:blip r:embed="rId33"/>
                     <a:srcRect b="0" l="0" r="0" t="0"/>
                     <a:stretch>
                       <a:fillRect/>
@@ -5360,7 +5436,7 @@
                   <pic:spPr>
                     <a:xfrm>
                       <a:off x="0" y="0"/>
-                      <a:ext cx="5943600" cy="1155700"/>
+                      <a:ext cx="5943600" cy="1714500"/>
                     </a:xfrm>
                     <a:prstGeom prst="rect"/>
                     <a:ln/>
@@ -5379,25 +5455,12 @@
     </w:p>
     <w:p>
       <w:pPr>
-        <w:spacing w:before="200" w:line="240" w:lineRule="auto"/>
-        <w:rPr>
-          <w:rFonts w:ascii="Courier New" w:cs="Courier New" w:eastAsia="Courier New" w:hAnsi="Courier New"/>
-        </w:rPr>
-      </w:pPr>
-      <w:r>
-        <w:rPr>
-          <w:rtl w:val="0"/>
-        </w:rPr>
-      </w:r>
-    </w:p>
-    <w:p>
-      <w:pPr>
         <w:pStyle w:val="Heading3"/>
         <w:spacing w:after="0" w:before="200" w:line="240" w:lineRule="auto"/>
         <w:rPr/>
       </w:pPr>
-      <w:bookmarkStart w:colFirst="0" w:colLast="0" w:name="_moyh3mhl4b8v" w:id="10"/>
-      <w:bookmarkEnd w:id="10"/>
+      <w:bookmarkStart w:colFirst="0" w:colLast="0" w:name="_moyh3mhl4b8v" w:id="9"/>
+      <w:bookmarkEnd w:id="9"/>
       <w:r>
         <w:rPr>
           <w:rtl w:val="0"/>
@@ -5423,49 +5486,7 @@
         <w:rPr>
           <w:rtl w:val="0"/>
         </w:rPr>
-        <w:t xml:space="preserve">At this point we will now execute the steps as per </w:t>
-      </w:r>
-      <w:hyperlink r:id="rId33">
-        <w:r>
-          <w:rPr>
-            <w:color w:val="1155cc"/>
-            <w:u w:val="single"/>
-            <w:rtl w:val="0"/>
-          </w:rPr>
-          <w:t xml:space="preserve">GITOPS.md</w:t>
-        </w:r>
-      </w:hyperlink>
-      <w:r>
-        <w:rPr>
-          <w:rtl w:val="0"/>
-        </w:rPr>
-        <w:t xml:space="preserve">.</w:t>
-      </w:r>
-      <w:r>
-        <w:rPr>
-          <w:rtl w:val="0"/>
-        </w:rPr>
-      </w:r>
-    </w:p>
-    <w:p>
-      <w:pPr>
-        <w:rPr/>
-      </w:pPr>
-      <w:r>
-        <w:rPr>
-          <w:rtl w:val="0"/>
-        </w:rPr>
-      </w:r>
-    </w:p>
-    <w:p>
-      <w:pPr>
-        <w:rPr/>
-      </w:pPr>
-      <w:r>
-        <w:rPr>
-          <w:rtl w:val="0"/>
-        </w:rPr>
-        <w:t xml:space="preserve">The below steps are as per step #3 in the </w:t>
+        <w:t xml:space="preserve">Next is our GitOps pipeline, which we will execute by following the steps as per </w:t>
       </w:r>
       <w:hyperlink r:id="rId34">
         <w:r>
@@ -5481,6 +5502,48 @@
         <w:rPr>
           <w:rtl w:val="0"/>
         </w:rPr>
+        <w:t xml:space="preserve">.</w:t>
+      </w:r>
+      <w:r>
+        <w:rPr>
+          <w:rtl w:val="0"/>
+        </w:rPr>
+      </w:r>
+    </w:p>
+    <w:p>
+      <w:pPr>
+        <w:rPr/>
+      </w:pPr>
+      <w:r>
+        <w:rPr>
+          <w:rtl w:val="0"/>
+        </w:rPr>
+      </w:r>
+    </w:p>
+    <w:p>
+      <w:pPr>
+        <w:rPr/>
+      </w:pPr>
+      <w:r>
+        <w:rPr>
+          <w:rtl w:val="0"/>
+        </w:rPr>
+        <w:t xml:space="preserve">The below steps are as per step #3 in the </w:t>
+      </w:r>
+      <w:hyperlink r:id="rId35">
+        <w:r>
+          <w:rPr>
+            <w:color w:val="1155cc"/>
+            <w:u w:val="single"/>
+            <w:rtl w:val="0"/>
+          </w:rPr>
+          <w:t xml:space="preserve">GITOPS.md</w:t>
+        </w:r>
+      </w:hyperlink>
+      <w:r>
+        <w:rPr>
+          <w:rtl w:val="0"/>
+        </w:rPr>
         <w:t xml:space="preserve"> document.</w:t>
       </w:r>
     </w:p>
@@ -5499,8 +5562,8 @@
         <w:pStyle w:val="Heading2"/>
         <w:rPr/>
       </w:pPr>
-      <w:bookmarkStart w:colFirst="0" w:colLast="0" w:name="_kmqr46wabc4f" w:id="11"/>
-      <w:bookmarkEnd w:id="11"/>
+      <w:bookmarkStart w:colFirst="0" w:colLast="0" w:name="_kmqr46wabc4f" w:id="10"/>
+      <w:bookmarkEnd w:id="10"/>
       <w:r>
         <w:rPr>
           <w:rtl w:val="0"/>
@@ -5516,6 +5579,7 @@
         <w:rPr>
           <w:rtl w:val="0"/>
         </w:rPr>
+        <w:t xml:space="preserve">First we will deploy ArgoCD</w:t>
       </w:r>
     </w:p>
     <w:tbl>
@@ -5625,16 +5689,16 @@
           <wp:inline distB="114300" distT="114300" distL="114300" distR="114300">
             <wp:extent cx="5943600" cy="6616700"/>
             <wp:effectExtent b="0" l="0" r="0" t="0"/>
-            <wp:docPr id="18" name="image21.png"/>
+            <wp:docPr id="18" name="image22.png"/>
             <a:graphic>
               <a:graphicData uri="http://schemas.openxmlformats.org/drawingml/2006/picture">
                 <pic:pic>
                   <pic:nvPicPr>
-                    <pic:cNvPr id="0" name="image21.png"/>
+                    <pic:cNvPr id="0" name="image22.png"/>
                     <pic:cNvPicPr preferRelativeResize="0"/>
                   </pic:nvPicPr>
                   <pic:blipFill>
-                    <a:blip r:embed="rId35"/>
+                    <a:blip r:embed="rId36"/>
                     <a:srcRect b="0" l="0" r="0" t="0"/>
                     <a:stretch>
                       <a:fillRect/>
@@ -5669,6 +5733,7 @@
         <w:rPr>
           <w:rtl w:val="0"/>
         </w:rPr>
+        <w:t xml:space="preserve">This will put the kubectl into watch mode, hit control C once everything is running.</w:t>
       </w:r>
     </w:p>
     <w:tbl>
@@ -5760,16 +5825,16 @@
           <wp:inline distB="114300" distT="114300" distL="114300" distR="114300">
             <wp:extent cx="5943600" cy="1524000"/>
             <wp:effectExtent b="0" l="0" r="0" t="0"/>
-            <wp:docPr id="20" name="image18.png"/>
+            <wp:docPr id="20" name="image12.png"/>
             <a:graphic>
               <a:graphicData uri="http://schemas.openxmlformats.org/drawingml/2006/picture">
                 <pic:pic>
                   <pic:nvPicPr>
-                    <pic:cNvPr id="0" name="image18.png"/>
+                    <pic:cNvPr id="0" name="image12.png"/>
                     <pic:cNvPicPr preferRelativeResize="0"/>
                   </pic:nvPicPr>
                   <pic:blipFill>
-                    <a:blip r:embed="rId36"/>
+                    <a:blip r:embed="rId37"/>
                     <a:srcRect b="0" l="0" r="0" t="0"/>
                     <a:stretch>
                       <a:fillRect/>
@@ -5800,8 +5865,8 @@
         <w:pStyle w:val="Heading2"/>
         <w:rPr/>
       </w:pPr>
-      <w:bookmarkStart w:colFirst="0" w:colLast="0" w:name="_szb7ffrdabas" w:id="12"/>
-      <w:bookmarkEnd w:id="12"/>
+      <w:bookmarkStart w:colFirst="0" w:colLast="0" w:name="_szb7ffrdabas" w:id="11"/>
+      <w:bookmarkEnd w:id="11"/>
       <w:r>
         <w:rPr>
           <w:rtl w:val="0"/>
@@ -5830,529 +5895,6 @@
           <w:rtl w:val="0"/>
         </w:rPr>
         <w:t xml:space="preserve">First we need to create a project in </w:t>
-      </w:r>
-      <w:hyperlink r:id="rId37">
-        <w:r>
-          <w:rPr>
-            <w:color w:val="1155cc"/>
-            <w:u w:val="single"/>
-            <w:rtl w:val="0"/>
-          </w:rPr>
-          <w:t xml:space="preserve">hub.docker.com</w:t>
-        </w:r>
-      </w:hyperlink>
-      <w:r>
-        <w:rPr>
-          <w:rtl w:val="0"/>
-        </w:rPr>
-        <w:t xml:space="preserve">. Once we have a project we create an access token, also referred to as a Personal Access Token.</w:t>
-      </w:r>
-    </w:p>
-    <w:p>
-      <w:pPr>
-        <w:ind w:left="0" w:firstLine="0"/>
-        <w:rPr/>
-      </w:pPr>
-      <w:r>
-        <w:rPr>
-          <w:rtl w:val="0"/>
-        </w:rPr>
-      </w:r>
-    </w:p>
-    <w:p>
-      <w:pPr>
-        <w:pStyle w:val="Heading2"/>
-        <w:rPr/>
-      </w:pPr>
-      <w:bookmarkStart w:colFirst="0" w:colLast="0" w:name="_yhfhemm5rb10" w:id="13"/>
-      <w:bookmarkEnd w:id="13"/>
-      <w:r>
-        <w:rPr>
-          <w:rtl w:val="0"/>
-        </w:rPr>
-        <w:t xml:space="preserve">Phase 3</w:t>
-      </w:r>
-    </w:p>
-    <w:p>
-      <w:pPr>
-        <w:ind w:left="0" w:firstLine="0"/>
-        <w:rPr/>
-      </w:pPr>
-      <w:r>
-        <w:rPr>
-          <w:rtl w:val="0"/>
-        </w:rPr>
-      </w:r>
-    </w:p>
-    <w:p>
-      <w:pPr>
-        <w:ind w:left="0" w:firstLine="0"/>
-        <w:rPr/>
-      </w:pPr>
-      <w:r>
-        <w:rPr>
-          <w:rtl w:val="0"/>
-        </w:rPr>
-        <w:t xml:space="preserve">Once we have the above container project created and the access key (Personal Access Token) created we configure Github with </w:t>
-      </w:r>
-      <w:r>
-        <w:rPr>
-          <w:b w:val="1"/>
-          <w:bCs w:val="1"/>
-          <w:rtl w:val="0"/>
-        </w:rPr>
-        <w:t xml:space="preserve">Secrets and variables/Actions</w:t>
-      </w:r>
-      <w:r>
-        <w:rPr>
-          <w:i w:val="1"/>
-          <w:iCs w:val="1"/>
-          <w:rtl w:val="0"/>
-        </w:rPr>
-        <w:t xml:space="preserve">.</w:t>
-      </w:r>
-      <w:r>
-        <w:rPr>
-          <w:rtl w:val="0"/>
-        </w:rPr>
-        <w:t xml:space="preserve"> </w:t>
-      </w:r>
-    </w:p>
-    <w:p>
-      <w:pPr>
-        <w:ind w:left="0" w:firstLine="0"/>
-        <w:rPr/>
-      </w:pPr>
-      <w:r>
-        <w:rPr>
-          <w:rtl w:val="0"/>
-        </w:rPr>
-      </w:r>
-    </w:p>
-    <w:p>
-      <w:pPr>
-        <w:ind w:left="0" w:firstLine="0"/>
-        <w:rPr/>
-      </w:pPr>
-      <w:r>
-        <w:rPr>
-          <w:rtl w:val="0"/>
-        </w:rPr>
-        <w:t xml:space="preserve">This grants GitHub with Read/Write access to create a new container in the project.</w:t>
-      </w:r>
-    </w:p>
-    <w:p>
-      <w:pPr>
-        <w:rPr/>
-      </w:pPr>
-      <w:r>
-        <w:rPr>
-          <w:rtl w:val="0"/>
-        </w:rPr>
-      </w:r>
-    </w:p>
-    <w:p>
-      <w:pPr>
-        <w:rPr/>
-      </w:pPr>
-      <w:r>
-        <w:rPr>
-          <w:rtl w:val="0"/>
-        </w:rPr>
-        <w:t xml:space="preserve">Think of GitHub as the builder that needs keys to enter your warehouse (Docker Hub). If you paste these keys directly into your code, anyone who looks at your repository can steal them. Instead, you put them into GitHub's secure vault called Actions Secrets.</w:t>
-      </w:r>
-    </w:p>
-    <w:p>
-      <w:pPr>
-        <w:rPr/>
-      </w:pPr>
-      <w:r>
-        <w:rPr>
-          <w:rtl w:val="0"/>
-        </w:rPr>
-      </w:r>
-    </w:p>
-    <w:p>
-      <w:pPr>
-        <w:rPr/>
-      </w:pPr>
-      <w:r>
-        <w:rPr>
-          <w:rtl w:val="0"/>
-        </w:rPr>
-        <w:t xml:space="preserve">Here is exactly what you do, step-by-step, inside your web browser.</w:t>
-      </w:r>
-    </w:p>
-    <w:p>
-      <w:pPr>
-        <w:rPr/>
-      </w:pPr>
-      <w:r>
-        <w:rPr>
-          <w:rtl w:val="0"/>
-        </w:rPr>
-      </w:r>
-    </w:p>
-    <w:p>
-      <w:pPr>
-        <w:rPr>
-          <w:rFonts w:ascii="Courier New" w:cs="Courier New" w:eastAsia="Courier New" w:hAnsi="Courier New"/>
-          <w:b w:val="1"/>
-          <w:bCs w:val="1"/>
-        </w:rPr>
-      </w:pPr>
-      <w:r>
-        <w:rPr>
-          <w:b w:val="1"/>
-          <w:bCs w:val="1"/>
-          <w:rtl w:val="0"/>
-        </w:rPr>
-        <w:t xml:space="preserve">Step 0: Register/Create new repository</w:t>
-      </w:r>
-      <w:r>
-        <w:rPr>
-          <w:rtl w:val="0"/>
-        </w:rPr>
-        <w:t xml:space="preserve">, for our blog we're using </w:t>
-      </w:r>
-      <w:r>
-        <w:rPr>
-          <w:rFonts w:ascii="Courier New" w:cs="Courier New" w:eastAsia="Courier New" w:hAnsi="Courier New"/>
-          <w:b w:val="1"/>
-          <w:bCs w:val="1"/>
-          <w:rtl w:val="0"/>
-        </w:rPr>
-        <w:t xml:space="preserve">gitops-pipeline</w:t>
-      </w:r>
-    </w:p>
-    <w:p>
-      <w:pPr>
-        <w:rPr/>
-      </w:pPr>
-      <w:r>
-        <w:rPr>
-          <w:rtl w:val="0"/>
-        </w:rPr>
-      </w:r>
-    </w:p>
-    <w:p>
-      <w:pPr>
-        <w:rPr>
-          <w:b w:val="1"/>
-          <w:bCs w:val="1"/>
-        </w:rPr>
-      </w:pPr>
-      <w:r>
-        <w:rPr>
-          <w:b w:val="1"/>
-          <w:bCs w:val="1"/>
-          <w:rtl w:val="0"/>
-        </w:rPr>
-        <w:t xml:space="preserve">Step 1: Open Your Repository's Vault</w:t>
-      </w:r>
-    </w:p>
-    <w:p>
-      <w:pPr>
-        <w:rPr/>
-      </w:pPr>
-      <w:r>
-        <w:rPr>
-          <w:rtl w:val="0"/>
-        </w:rPr>
-      </w:r>
-    </w:p>
-    <w:p>
-      <w:pPr>
-        <w:numPr>
-          <w:ilvl w:val="0"/>
-          <w:numId w:val="8"/>
-        </w:numPr>
-        <w:ind w:left="720" w:hanging="360"/>
-        <w:rPr>
-          <w:u w:val="none"/>
-        </w:rPr>
-      </w:pPr>
-      <w:r>
-        <w:rPr>
-          <w:rtl w:val="0"/>
-        </w:rPr>
-        <w:t xml:space="preserve">Open your web browser and go to GitHub.</w:t>
-      </w:r>
-    </w:p>
-    <w:p>
-      <w:pPr>
-        <w:numPr>
-          <w:ilvl w:val="0"/>
-          <w:numId w:val="15"/>
-        </w:numPr>
-        <w:ind w:left="720" w:hanging="360"/>
-        <w:rPr>
-          <w:u w:val="none"/>
-        </w:rPr>
-      </w:pPr>
-      <w:r>
-        <w:rPr>
-          <w:rtl w:val="0"/>
-        </w:rPr>
-        <w:t xml:space="preserve"> Navigate to your specific code repository for this project.</w:t>
-      </w:r>
-    </w:p>
-    <w:p>
-      <w:pPr>
-        <w:numPr>
-          <w:ilvl w:val="0"/>
-          <w:numId w:val="16"/>
-        </w:numPr>
-        <w:ind w:left="720" w:hanging="360"/>
-        <w:rPr>
-          <w:u w:val="none"/>
-        </w:rPr>
-      </w:pPr>
-      <w:r>
-        <w:rPr>
-          <w:rtl w:val="0"/>
-        </w:rPr>
-        <w:t xml:space="preserve"> Look at the horizontal menu tabs near the top (Code, Issues, Pull Requests...). Click on the Settings tab (it has a gear icon ⚙️).</w:t>
-      </w:r>
-    </w:p>
-    <w:p>
-      <w:pPr>
-        <w:rPr/>
-      </w:pPr>
-      <w:r>
-        <w:rPr>
-          <w:rtl w:val="0"/>
-        </w:rPr>
-      </w:r>
-    </w:p>
-    <w:p>
-      <w:pPr>
-        <w:rPr>
-          <w:b w:val="1"/>
-          <w:bCs w:val="1"/>
-        </w:rPr>
-      </w:pPr>
-      <w:r>
-        <w:rPr>
-          <w:b w:val="1"/>
-          <w:bCs w:val="1"/>
-          <w:rtl w:val="0"/>
-        </w:rPr>
-        <w:t xml:space="preserve">Step 2: Navigate to Actions Secrets</w:t>
-      </w:r>
-    </w:p>
-    <w:p>
-      <w:pPr>
-        <w:rPr/>
-      </w:pPr>
-      <w:r>
-        <w:rPr>
-          <w:rtl w:val="0"/>
-        </w:rPr>
-      </w:r>
-    </w:p>
-    <w:p>
-      <w:pPr>
-        <w:numPr>
-          <w:ilvl w:val="0"/>
-          <w:numId w:val="7"/>
-        </w:numPr>
-        <w:ind w:left="720" w:hanging="360"/>
-        <w:rPr>
-          <w:u w:val="none"/>
-        </w:rPr>
-      </w:pPr>
-      <w:r>
-        <w:rPr>
-          <w:rtl w:val="0"/>
-        </w:rPr>
-        <w:t xml:space="preserve">On the left-hand sidebar, scroll down until you see the </w:t>
-      </w:r>
-      <w:r>
-        <w:rPr>
-          <w:b w:val="1"/>
-          <w:bCs w:val="1"/>
-          <w:i w:val="1"/>
-          <w:iCs w:val="1"/>
-          <w:rtl w:val="0"/>
-        </w:rPr>
-        <w:t xml:space="preserve">Security and quality</w:t>
-      </w:r>
-      <w:r>
-        <w:rPr>
-          <w:rtl w:val="0"/>
-        </w:rPr>
-        <w:t xml:space="preserve">.</w:t>
-      </w:r>
-    </w:p>
-    <w:p>
-      <w:pPr>
-        <w:numPr>
-          <w:ilvl w:val="0"/>
-          <w:numId w:val="10"/>
-        </w:numPr>
-        <w:ind w:left="720" w:hanging="360"/>
-        <w:rPr>
-          <w:u w:val="none"/>
-        </w:rPr>
-      </w:pPr>
-      <w:r>
-        <w:rPr>
-          <w:rtl w:val="0"/>
-        </w:rPr>
-        <w:t xml:space="preserve">Click on </w:t>
-      </w:r>
-      <w:r>
-        <w:rPr>
-          <w:b w:val="1"/>
-          <w:bCs w:val="1"/>
-          <w:i w:val="1"/>
-          <w:iCs w:val="1"/>
-          <w:rtl w:val="0"/>
-        </w:rPr>
-        <w:t xml:space="preserve">secrets and variables</w:t>
-      </w:r>
-      <w:r>
-        <w:rPr>
-          <w:rtl w:val="0"/>
-        </w:rPr>
-        <w:t xml:space="preserve"> and variables to expand it, then click on Actions.</w:t>
-      </w:r>
-    </w:p>
-    <w:p>
-      <w:pPr>
-        <w:rPr/>
-      </w:pPr>
-      <w:r>
-        <w:rPr>
-          <w:rtl w:val="0"/>
-        </w:rPr>
-      </w:r>
-    </w:p>
-    <w:p>
-      <w:pPr>
-        <w:rPr/>
-      </w:pPr>
-      <w:r>
-        <w:rPr>
-          <w:rtl w:val="0"/>
-        </w:rPr>
-        <w:t xml:space="preserve">You are now in the secure vault workspace.</w:t>
-      </w:r>
-    </w:p>
-    <w:p>
-      <w:pPr>
-        <w:rPr/>
-      </w:pPr>
-      <w:r>
-        <w:rPr>
-          <w:rtl w:val="0"/>
-        </w:rPr>
-      </w:r>
-    </w:p>
-    <w:p>
-      <w:pPr>
-        <w:rPr>
-          <w:b w:val="1"/>
-          <w:bCs w:val="1"/>
-        </w:rPr>
-      </w:pPr>
-      <w:r>
-        <w:rPr>
-          <w:b w:val="1"/>
-          <w:bCs w:val="1"/>
-          <w:rtl w:val="0"/>
-        </w:rPr>
-        <w:t xml:space="preserve">Step 3: Add Your Docker Hub Username</w:t>
-      </w:r>
-    </w:p>
-    <w:p>
-      <w:pPr>
-        <w:rPr/>
-      </w:pPr>
-      <w:r>
-        <w:rPr>
-          <w:rtl w:val="0"/>
-        </w:rPr>
-      </w:r>
-    </w:p>
-    <w:p>
-      <w:pPr>
-        <w:numPr>
-          <w:ilvl w:val="0"/>
-          <w:numId w:val="18"/>
-        </w:numPr>
-        <w:ind w:left="720" w:hanging="360"/>
-        <w:rPr>
-          <w:u w:val="none"/>
-        </w:rPr>
-      </w:pPr>
-      <w:r>
-        <w:rPr>
-          <w:rtl w:val="0"/>
-        </w:rPr>
-        <w:t xml:space="preserve">Click the green button at the Right/middle that says </w:t>
-      </w:r>
-      <w:r>
-        <w:rPr>
-          <w:b w:val="1"/>
-          <w:bCs w:val="1"/>
-          <w:i w:val="1"/>
-          <w:iCs w:val="1"/>
-          <w:rtl w:val="0"/>
-        </w:rPr>
-        <w:t xml:space="preserve">New repository secret</w:t>
-      </w:r>
-      <w:r>
-        <w:rPr>
-          <w:rtl w:val="0"/>
-        </w:rPr>
-        <w:t xml:space="preserve">.</w:t>
-      </w:r>
-    </w:p>
-    <w:p>
-      <w:pPr>
-        <w:numPr>
-          <w:ilvl w:val="0"/>
-          <w:numId w:val="11"/>
-        </w:numPr>
-        <w:ind w:left="720" w:hanging="360"/>
-        <w:rPr>
-          <w:u w:val="none"/>
-        </w:rPr>
-      </w:pPr>
-      <w:r>
-        <w:rPr>
-          <w:rtl w:val="0"/>
-        </w:rPr>
-        <w:t xml:space="preserve"> In the Name field, type exactly this:  </w:t>
-      </w:r>
-      <w:r>
-        <w:rPr>
-          <w:rFonts w:ascii="Courier New" w:cs="Courier New" w:eastAsia="Courier New" w:hAnsi="Courier New"/>
-          <w:b w:val="1"/>
-          <w:bCs w:val="1"/>
-          <w:rtl w:val="0"/>
-        </w:rPr>
-        <w:t xml:space="preserve">DOCKERHUB_USERNAME</w:t>
-      </w:r>
-    </w:p>
-    <w:p>
-      <w:pPr>
-        <w:numPr>
-          <w:ilvl w:val="0"/>
-          <w:numId w:val="2"/>
-        </w:numPr>
-        <w:ind w:left="720" w:hanging="360"/>
-        <w:rPr>
-          <w:u w:val="none"/>
-        </w:rPr>
-      </w:pPr>
-      <w:r>
-        <w:rPr>
-          <w:rtl w:val="0"/>
-        </w:rPr>
-        <w:t xml:space="preserve">In the Secret field, type your actual Docker Hub username (the name you use to log into </w:t>
       </w:r>
       <w:hyperlink r:id="rId38">
         <w:r>
@@ -6368,6 +5910,561 @@
         <w:rPr>
           <w:rtl w:val="0"/>
         </w:rPr>
+        <w:t xml:space="preserve">. Once we have a project we create an access token, also referred to as a </w:t>
+      </w:r>
+      <w:r>
+        <w:rPr>
+          <w:b w:val="1"/>
+          <w:bCs w:val="1"/>
+          <w:i w:val="1"/>
+          <w:iCs w:val="1"/>
+          <w:rtl w:val="0"/>
+        </w:rPr>
+        <w:t xml:space="preserve">Personal Access Token</w:t>
+      </w:r>
+      <w:r>
+        <w:rPr>
+          <w:rtl w:val="0"/>
+        </w:rPr>
+        <w:t xml:space="preserve">.</w:t>
+      </w:r>
+    </w:p>
+    <w:p>
+      <w:pPr>
+        <w:ind w:left="0" w:firstLine="0"/>
+        <w:rPr/>
+      </w:pPr>
+      <w:r>
+        <w:rPr>
+          <w:rtl w:val="0"/>
+        </w:rPr>
+      </w:r>
+    </w:p>
+    <w:p>
+      <w:pPr>
+        <w:pStyle w:val="Heading2"/>
+        <w:rPr/>
+      </w:pPr>
+      <w:bookmarkStart w:colFirst="0" w:colLast="0" w:name="_yhfhemm5rb10" w:id="12"/>
+      <w:bookmarkEnd w:id="12"/>
+      <w:r>
+        <w:rPr>
+          <w:rtl w:val="0"/>
+        </w:rPr>
+        <w:t xml:space="preserve">Phase 3</w:t>
+      </w:r>
+    </w:p>
+    <w:p>
+      <w:pPr>
+        <w:ind w:left="0" w:firstLine="0"/>
+        <w:rPr/>
+      </w:pPr>
+      <w:r>
+        <w:rPr>
+          <w:rtl w:val="0"/>
+        </w:rPr>
+      </w:r>
+    </w:p>
+    <w:p>
+      <w:pPr>
+        <w:ind w:left="0" w:firstLine="0"/>
+        <w:rPr/>
+      </w:pPr>
+      <w:r>
+        <w:rPr>
+          <w:rtl w:val="0"/>
+        </w:rPr>
+        <w:t xml:space="preserve">Once we have the above container project created and the access key (Personal Access Token) created we configure Github with </w:t>
+      </w:r>
+      <w:r>
+        <w:rPr>
+          <w:b w:val="1"/>
+          <w:bCs w:val="1"/>
+          <w:rtl w:val="0"/>
+        </w:rPr>
+        <w:t xml:space="preserve">Secrets and variables/Actions</w:t>
+      </w:r>
+      <w:r>
+        <w:rPr>
+          <w:i w:val="1"/>
+          <w:iCs w:val="1"/>
+          <w:rtl w:val="0"/>
+        </w:rPr>
+        <w:t xml:space="preserve">.</w:t>
+      </w:r>
+      <w:r>
+        <w:rPr>
+          <w:rtl w:val="0"/>
+        </w:rPr>
+        <w:t xml:space="preserve"> </w:t>
+      </w:r>
+    </w:p>
+    <w:p>
+      <w:pPr>
+        <w:ind w:left="0" w:firstLine="0"/>
+        <w:rPr/>
+      </w:pPr>
+      <w:r>
+        <w:rPr>
+          <w:rtl w:val="0"/>
+        </w:rPr>
+      </w:r>
+    </w:p>
+    <w:p>
+      <w:pPr>
+        <w:ind w:left="0" w:firstLine="0"/>
+        <w:rPr/>
+      </w:pPr>
+      <w:r>
+        <w:rPr>
+          <w:rtl w:val="0"/>
+        </w:rPr>
+        <w:t xml:space="preserve">This grants GitHub with the required Read/Write access to create a new container in the Docker project.</w:t>
+      </w:r>
+    </w:p>
+    <w:p>
+      <w:pPr>
+        <w:rPr/>
+      </w:pPr>
+      <w:r>
+        <w:rPr>
+          <w:rtl w:val="0"/>
+        </w:rPr>
+      </w:r>
+    </w:p>
+    <w:p>
+      <w:pPr>
+        <w:rPr/>
+      </w:pPr>
+      <w:r>
+        <w:rPr>
+          <w:rtl w:val="0"/>
+        </w:rPr>
+        <w:t xml:space="preserve">Think of GitHub as the builder that needs keys to enter your warehouse (Docker Hub). If you paste these keys directly into your code, anyone who looks at your repository can steal them. Instead, you put them into GitHub's secure vault called </w:t>
+      </w:r>
+      <w:r>
+        <w:rPr>
+          <w:b w:val="1"/>
+          <w:bCs w:val="1"/>
+          <w:i w:val="1"/>
+          <w:iCs w:val="1"/>
+          <w:rtl w:val="0"/>
+        </w:rPr>
+        <w:t xml:space="preserve">Actions Secrets</w:t>
+      </w:r>
+      <w:r>
+        <w:rPr>
+          <w:rtl w:val="0"/>
+        </w:rPr>
+        <w:t xml:space="preserve">.</w:t>
+      </w:r>
+    </w:p>
+    <w:p>
+      <w:pPr>
+        <w:rPr/>
+      </w:pPr>
+      <w:r>
+        <w:rPr>
+          <w:rtl w:val="0"/>
+        </w:rPr>
+      </w:r>
+    </w:p>
+    <w:p>
+      <w:pPr>
+        <w:rPr/>
+      </w:pPr>
+      <w:r>
+        <w:rPr>
+          <w:rtl w:val="0"/>
+        </w:rPr>
+        <w:t xml:space="preserve">Here is exactly what you do, step-by-step, inside your web browser.</w:t>
+      </w:r>
+    </w:p>
+    <w:p>
+      <w:pPr>
+        <w:rPr/>
+      </w:pPr>
+      <w:r>
+        <w:rPr>
+          <w:rtl w:val="0"/>
+        </w:rPr>
+      </w:r>
+    </w:p>
+    <w:p>
+      <w:pPr>
+        <w:rPr>
+          <w:rFonts w:ascii="Courier New" w:cs="Courier New" w:eastAsia="Courier New" w:hAnsi="Courier New"/>
+          <w:b w:val="1"/>
+          <w:bCs w:val="1"/>
+        </w:rPr>
+      </w:pPr>
+      <w:r>
+        <w:rPr>
+          <w:b w:val="1"/>
+          <w:bCs w:val="1"/>
+          <w:rtl w:val="0"/>
+        </w:rPr>
+        <w:t xml:space="preserve">Step 0: Register/Create new repository</w:t>
+      </w:r>
+      <w:r>
+        <w:rPr>
+          <w:rtl w:val="0"/>
+        </w:rPr>
+        <w:t xml:space="preserve">, for our blog we're using </w:t>
+      </w:r>
+      <w:r>
+        <w:rPr>
+          <w:rFonts w:ascii="Courier New" w:cs="Courier New" w:eastAsia="Courier New" w:hAnsi="Courier New"/>
+          <w:b w:val="1"/>
+          <w:bCs w:val="1"/>
+          <w:rtl w:val="0"/>
+        </w:rPr>
+        <w:t xml:space="preserve">gitops-pipeline</w:t>
+      </w:r>
+    </w:p>
+    <w:p>
+      <w:pPr>
+        <w:rPr/>
+      </w:pPr>
+      <w:r>
+        <w:rPr>
+          <w:rtl w:val="0"/>
+        </w:rPr>
+      </w:r>
+    </w:p>
+    <w:p>
+      <w:pPr>
+        <w:rPr>
+          <w:b w:val="1"/>
+          <w:bCs w:val="1"/>
+        </w:rPr>
+      </w:pPr>
+      <w:r>
+        <w:rPr>
+          <w:b w:val="1"/>
+          <w:bCs w:val="1"/>
+          <w:rtl w:val="0"/>
+        </w:rPr>
+        <w:t xml:space="preserve">Step 1: Open Your Repository's Vault</w:t>
+      </w:r>
+    </w:p>
+    <w:p>
+      <w:pPr>
+        <w:rPr/>
+      </w:pPr>
+      <w:r>
+        <w:rPr>
+          <w:rtl w:val="0"/>
+        </w:rPr>
+      </w:r>
+    </w:p>
+    <w:p>
+      <w:pPr>
+        <w:numPr>
+          <w:ilvl w:val="0"/>
+          <w:numId w:val="8"/>
+        </w:numPr>
+        <w:ind w:left="720" w:hanging="360"/>
+        <w:rPr>
+          <w:u w:val="none"/>
+        </w:rPr>
+      </w:pPr>
+      <w:r>
+        <w:rPr>
+          <w:rtl w:val="0"/>
+        </w:rPr>
+        <w:t xml:space="preserve">Open your web browser and go to GitHub.</w:t>
+      </w:r>
+    </w:p>
+    <w:p>
+      <w:pPr>
+        <w:numPr>
+          <w:ilvl w:val="0"/>
+          <w:numId w:val="15"/>
+        </w:numPr>
+        <w:ind w:left="720" w:hanging="360"/>
+        <w:rPr>
+          <w:u w:val="none"/>
+        </w:rPr>
+      </w:pPr>
+      <w:r>
+        <w:rPr>
+          <w:rtl w:val="0"/>
+        </w:rPr>
+        <w:t xml:space="preserve">Navigate to your specific code repository for this project.</w:t>
+      </w:r>
+    </w:p>
+    <w:p>
+      <w:pPr>
+        <w:numPr>
+          <w:ilvl w:val="0"/>
+          <w:numId w:val="16"/>
+        </w:numPr>
+        <w:ind w:left="720" w:hanging="360"/>
+        <w:rPr>
+          <w:u w:val="none"/>
+        </w:rPr>
+      </w:pPr>
+      <w:r>
+        <w:rPr>
+          <w:rtl w:val="0"/>
+        </w:rPr>
+        <w:t xml:space="preserve">Look at the horizontal menu tabs near the top (Code, Issues, Pull Requests...). Click on the Settings tab (it has a gear icon ⚙️).</w:t>
+      </w:r>
+    </w:p>
+    <w:p>
+      <w:pPr>
+        <w:rPr/>
+      </w:pPr>
+      <w:r>
+        <w:rPr>
+          <w:rtl w:val="0"/>
+        </w:rPr>
+      </w:r>
+    </w:p>
+    <w:p>
+      <w:pPr>
+        <w:rPr>
+          <w:b w:val="1"/>
+          <w:bCs w:val="1"/>
+        </w:rPr>
+      </w:pPr>
+      <w:r>
+        <w:rPr>
+          <w:b w:val="1"/>
+          <w:bCs w:val="1"/>
+          <w:rtl w:val="0"/>
+        </w:rPr>
+        <w:t xml:space="preserve">Step 2: Navigate to Actions Secrets</w:t>
+      </w:r>
+    </w:p>
+    <w:p>
+      <w:pPr>
+        <w:rPr/>
+      </w:pPr>
+      <w:r>
+        <w:rPr>
+          <w:rtl w:val="0"/>
+        </w:rPr>
+      </w:r>
+    </w:p>
+    <w:p>
+      <w:pPr>
+        <w:numPr>
+          <w:ilvl w:val="0"/>
+          <w:numId w:val="7"/>
+        </w:numPr>
+        <w:ind w:left="720" w:hanging="360"/>
+        <w:rPr>
+          <w:u w:val="none"/>
+        </w:rPr>
+      </w:pPr>
+      <w:r>
+        <w:rPr>
+          <w:rtl w:val="0"/>
+        </w:rPr>
+        <w:t xml:space="preserve">On the left-hand sidebar, scroll down until you see the </w:t>
+      </w:r>
+      <w:r>
+        <w:rPr>
+          <w:b w:val="1"/>
+          <w:bCs w:val="1"/>
+          <w:i w:val="1"/>
+          <w:iCs w:val="1"/>
+          <w:rtl w:val="0"/>
+        </w:rPr>
+        <w:t xml:space="preserve">Security and quality</w:t>
+      </w:r>
+      <w:r>
+        <w:rPr>
+          <w:rtl w:val="0"/>
+        </w:rPr>
+        <w:t xml:space="preserve">.</w:t>
+      </w:r>
+    </w:p>
+    <w:p>
+      <w:pPr>
+        <w:numPr>
+          <w:ilvl w:val="0"/>
+          <w:numId w:val="10"/>
+        </w:numPr>
+        <w:ind w:left="720" w:hanging="360"/>
+        <w:rPr>
+          <w:u w:val="none"/>
+        </w:rPr>
+      </w:pPr>
+      <w:r>
+        <w:rPr>
+          <w:rtl w:val="0"/>
+        </w:rPr>
+        <w:t xml:space="preserve">Click on </w:t>
+      </w:r>
+      <w:r>
+        <w:rPr>
+          <w:b w:val="1"/>
+          <w:bCs w:val="1"/>
+          <w:i w:val="1"/>
+          <w:iCs w:val="1"/>
+          <w:rtl w:val="0"/>
+        </w:rPr>
+        <w:t xml:space="preserve">secrets and variables</w:t>
+      </w:r>
+      <w:r>
+        <w:rPr>
+          <w:rtl w:val="0"/>
+        </w:rPr>
+        <w:t xml:space="preserve"> and variables to expand it, then click on Actions.</w:t>
+      </w:r>
+    </w:p>
+    <w:p>
+      <w:pPr>
+        <w:rPr/>
+      </w:pPr>
+      <w:r>
+        <w:rPr>
+          <w:rtl w:val="0"/>
+        </w:rPr>
+      </w:r>
+    </w:p>
+    <w:p>
+      <w:pPr>
+        <w:rPr/>
+      </w:pPr>
+      <w:r>
+        <w:rPr>
+          <w:rtl w:val="0"/>
+        </w:rPr>
+        <w:t xml:space="preserve">You are now in the secure vault workspace.</w:t>
+      </w:r>
+    </w:p>
+    <w:p>
+      <w:pPr>
+        <w:rPr/>
+      </w:pPr>
+      <w:r>
+        <w:rPr>
+          <w:rtl w:val="0"/>
+        </w:rPr>
+      </w:r>
+    </w:p>
+    <w:p>
+      <w:pPr>
+        <w:rPr>
+          <w:b w:val="1"/>
+          <w:bCs w:val="1"/>
+        </w:rPr>
+      </w:pPr>
+      <w:r>
+        <w:rPr>
+          <w:b w:val="1"/>
+          <w:bCs w:val="1"/>
+          <w:rtl w:val="0"/>
+        </w:rPr>
+        <w:t xml:space="preserve">Step 3: Add Your Docker Hub Username</w:t>
+      </w:r>
+    </w:p>
+    <w:p>
+      <w:pPr>
+        <w:rPr/>
+      </w:pPr>
+      <w:r>
+        <w:rPr>
+          <w:rtl w:val="0"/>
+        </w:rPr>
+      </w:r>
+    </w:p>
+    <w:p>
+      <w:pPr>
+        <w:numPr>
+          <w:ilvl w:val="0"/>
+          <w:numId w:val="18"/>
+        </w:numPr>
+        <w:ind w:left="720" w:hanging="360"/>
+        <w:rPr>
+          <w:u w:val="none"/>
+        </w:rPr>
+      </w:pPr>
+      <w:r>
+        <w:rPr>
+          <w:rtl w:val="0"/>
+        </w:rPr>
+        <w:t xml:space="preserve">Click the green button at the Right/middle that says </w:t>
+      </w:r>
+      <w:r>
+        <w:rPr>
+          <w:b w:val="1"/>
+          <w:bCs w:val="1"/>
+          <w:i w:val="1"/>
+          <w:iCs w:val="1"/>
+          <w:rtl w:val="0"/>
+        </w:rPr>
+        <w:t xml:space="preserve">New repository secret</w:t>
+      </w:r>
+      <w:r>
+        <w:rPr>
+          <w:rtl w:val="0"/>
+        </w:rPr>
+        <w:t xml:space="preserve">.</w:t>
+      </w:r>
+    </w:p>
+    <w:p>
+      <w:pPr>
+        <w:numPr>
+          <w:ilvl w:val="0"/>
+          <w:numId w:val="11"/>
+        </w:numPr>
+        <w:ind w:left="720" w:hanging="360"/>
+        <w:rPr>
+          <w:u w:val="none"/>
+        </w:rPr>
+      </w:pPr>
+      <w:r>
+        <w:rPr>
+          <w:rtl w:val="0"/>
+        </w:rPr>
+        <w:t xml:space="preserve"> In the Name field, type exactly this:  </w:t>
+      </w:r>
+      <w:r>
+        <w:rPr>
+          <w:rFonts w:ascii="Courier New" w:cs="Courier New" w:eastAsia="Courier New" w:hAnsi="Courier New"/>
+          <w:b w:val="1"/>
+          <w:bCs w:val="1"/>
+          <w:rtl w:val="0"/>
+        </w:rPr>
+        <w:t xml:space="preserve">DOCKERHUB_USERNAME</w:t>
+      </w:r>
+    </w:p>
+    <w:p>
+      <w:pPr>
+        <w:numPr>
+          <w:ilvl w:val="0"/>
+          <w:numId w:val="2"/>
+        </w:numPr>
+        <w:ind w:left="720" w:hanging="360"/>
+        <w:rPr>
+          <w:u w:val="none"/>
+        </w:rPr>
+      </w:pPr>
+      <w:r>
+        <w:rPr>
+          <w:rtl w:val="0"/>
+        </w:rPr>
+        <w:t xml:space="preserve">In the Secret field, type your actual Docker Hub username (the name you use to log into </w:t>
+      </w:r>
+      <w:hyperlink r:id="rId39">
+        <w:r>
+          <w:rPr>
+            <w:color w:val="1155cc"/>
+            <w:u w:val="single"/>
+            <w:rtl w:val="0"/>
+          </w:rPr>
+          <w:t xml:space="preserve">hub.docker.com</w:t>
+        </w:r>
+      </w:hyperlink>
+      <w:r>
+        <w:rPr>
+          <w:rtl w:val="0"/>
+        </w:rPr>
         <w:t xml:space="preserve">).</w:t>
       </w:r>
     </w:p>
@@ -6591,11 +6688,13 @@
         <w:rPr>
           <w:rtl w:val="0"/>
         </w:rPr>
-        <w:t xml:space="preserve">When you push your code, the GitHub-hosted runner spins up and runs the automated blueprint file (</w:t>
+        <w:t xml:space="preserve">When you now push your code, the GitHub-hosted runner spins up and runs the automated blueprint file (</w:t>
       </w:r>
       <w:r>
         <w:rPr>
           <w:rFonts w:ascii="Courier New" w:cs="Courier New" w:eastAsia="Courier New" w:hAnsi="Courier New"/>
+          <w:b w:val="1"/>
+          <w:bCs w:val="1"/>
           <w:rtl w:val="0"/>
         </w:rPr>
         <w:t xml:space="preserve">.github/workflows/ci.yml</w:t>
@@ -8472,16 +8571,16 @@
           <wp:inline distB="114300" distT="114300" distL="114300" distR="114300">
             <wp:extent cx="5943600" cy="3695700"/>
             <wp:effectExtent b="0" l="0" r="0" t="0"/>
-            <wp:docPr id="16" name="image11.png"/>
+            <wp:docPr id="16" name="image8.png"/>
             <a:graphic>
               <a:graphicData uri="http://schemas.openxmlformats.org/drawingml/2006/picture">
                 <pic:pic>
                   <pic:nvPicPr>
-                    <pic:cNvPr id="0" name="image11.png"/>
+                    <pic:cNvPr id="0" name="image8.png"/>
                     <pic:cNvPicPr preferRelativeResize="0"/>
                   </pic:nvPicPr>
                   <pic:blipFill>
-                    <a:blip r:embed="rId39"/>
+                    <a:blip r:embed="rId40"/>
                     <a:srcRect b="0" l="0" r="0" t="0"/>
                     <a:stretch>
                       <a:fillRect/>
@@ -8553,8 +8652,8 @@
         <w:pStyle w:val="Heading2"/>
         <w:rPr/>
       </w:pPr>
-      <w:bookmarkStart w:colFirst="0" w:colLast="0" w:name="_16qozj9lorid" w:id="14"/>
-      <w:bookmarkEnd w:id="14"/>
+      <w:bookmarkStart w:colFirst="0" w:colLast="0" w:name="_16qozj9lorid" w:id="13"/>
+      <w:bookmarkEnd w:id="13"/>
       <w:r>
         <w:rPr>
           <w:rtl w:val="0"/>
@@ -8601,7 +8700,7 @@
         <w:rPr>
           <w:rtl w:val="0"/>
         </w:rPr>
-        <w:t xml:space="preserve">Now, push your local folder setup to GitHub. This triggers the GitHub-hosted runner to provision its computing workspace, build the image, and output the tracking tag.</w:t>
+        <w:t xml:space="preserve">Now, we’re ready to push our local project/code to GitHub. This triggers the GitHub-hosted runner to provision its computing workspace, build the image, and output the tracking tag.</w:t>
       </w:r>
     </w:p>
     <w:p>
@@ -8790,8 +8889,8 @@
         <w:pStyle w:val="Heading2"/>
         <w:rPr/>
       </w:pPr>
-      <w:bookmarkStart w:colFirst="0" w:colLast="0" w:name="_a8fmtjwqwg8e" w:id="15"/>
-      <w:bookmarkEnd w:id="15"/>
+      <w:bookmarkStart w:colFirst="0" w:colLast="0" w:name="_a8fmtjwqwg8e" w:id="14"/>
+      <w:bookmarkEnd w:id="14"/>
       <w:r>
         <w:rPr>
           <w:rtl w:val="0"/>
@@ -8838,9 +8937,9 @@
         <w:rPr>
           <w:rtl w:val="0"/>
         </w:rPr>
-        <w:t xml:space="preserve">With the correct image tag committed back to your Git repository, instruct </w:t>
-      </w:r>
-      <w:hyperlink r:id="rId40">
+        <w:t xml:space="preserve">With the correct image tag committed back to your Git repository, we will now instruct </w:t>
+      </w:r>
+      <w:hyperlink r:id="rId41">
         <w:r>
           <w:rPr>
             <w:rFonts w:ascii="Cambria" w:cs="Cambria" w:eastAsia="Cambria" w:hAnsi="Cambria"/>
@@ -8857,17 +8956,68 @@
         <w:rPr>
           <w:rtl w:val="0"/>
         </w:rPr>
-        <w:t xml:space="preserve"> to monitor the repository and deploy the resources to your targeted namespace. Run this command on your cluster terminal:</w:t>
-      </w:r>
-    </w:p>
-    <w:p>
-      <w:pPr>
-        <w:rPr/>
-      </w:pPr>
-      <w:r>
-        <w:rPr>
-          <w:rtl w:val="0"/>
-        </w:rPr>
+        <w:t xml:space="preserve"> to monitor the repository and deploy the resources to our targeted namespace. You will notice we reference our </w:t>
+      </w:r>
+      <w:r>
+        <w:rPr>
+          <w:b w:val="1"/>
+          <w:bCs w:val="1"/>
+          <w:i w:val="1"/>
+          <w:iCs w:val="1"/>
+          <w:rtl w:val="0"/>
+        </w:rPr>
+        <w:t xml:space="preserve">project spec:source:repoURL</w:t>
+      </w:r>
+      <w:r>
+        <w:rPr>
+          <w:i w:val="1"/>
+          <w:iCs w:val="1"/>
+          <w:rtl w:val="0"/>
+        </w:rPr>
+        <w:t xml:space="preserve"> </w:t>
+      </w:r>
+      <w:r>
+        <w:rPr>
+          <w:rtl w:val="0"/>
+        </w:rPr>
+        <w:t xml:space="preserve">,also take note of the </w:t>
+      </w:r>
+      <w:r>
+        <w:rPr>
+          <w:b w:val="1"/>
+          <w:bCs w:val="1"/>
+          <w:i w:val="1"/>
+          <w:iCs w:val="1"/>
+          <w:rtl w:val="0"/>
+        </w:rPr>
+        <w:t xml:space="preserve">path</w:t>
+      </w:r>
+      <w:r>
+        <w:rPr>
+          <w:rtl w:val="0"/>
+        </w:rPr>
+        <w:t xml:space="preserve"> tag.</w:t>
+      </w:r>
+    </w:p>
+    <w:p>
+      <w:pPr>
+        <w:rPr/>
+      </w:pPr>
+      <w:r>
+        <w:rPr>
+          <w:rtl w:val="0"/>
+        </w:rPr>
+      </w:r>
+    </w:p>
+    <w:p>
+      <w:pPr>
+        <w:rPr/>
+      </w:pPr>
+      <w:r>
+        <w:rPr>
+          <w:rtl w:val="0"/>
+        </w:rPr>
+        <w:t xml:space="preserve">Run this command on your cluster terminal:</w:t>
       </w:r>
     </w:p>
     <w:tbl>
@@ -8948,6 +9098,17 @@
         </w:rPr>
       </w:r>
     </w:p>
+    <w:p>
+      <w:pPr>
+        <w:rPr/>
+      </w:pPr>
+      <w:r>
+        <w:rPr>
+          <w:rtl w:val="0"/>
+        </w:rPr>
+        <w:t xml:space="preserve">argocd-app.yml</w:t>
+      </w:r>
+    </w:p>
     <w:tbl>
       <w:tblPr>
         <w:tblStyle w:val="Table20"/>
@@ -9384,16 +9545,16 @@
           <wp:inline distB="114300" distT="114300" distL="114300" distR="114300">
             <wp:extent cx="5943600" cy="622300"/>
             <wp:effectExtent b="0" l="0" r="0" t="0"/>
-            <wp:docPr id="19" name="image1.png"/>
+            <wp:docPr id="19" name="image11.png"/>
             <a:graphic>
               <a:graphicData uri="http://schemas.openxmlformats.org/drawingml/2006/picture">
                 <pic:pic>
                   <pic:nvPicPr>
-                    <pic:cNvPr id="0" name="image1.png"/>
+                    <pic:cNvPr id="0" name="image11.png"/>
                     <pic:cNvPicPr preferRelativeResize="0"/>
                   </pic:nvPicPr>
                   <pic:blipFill>
-                    <a:blip r:embed="rId41"/>
+                    <a:blip r:embed="rId42"/>
                     <a:srcRect b="0" l="0" r="0" t="0"/>
                     <a:stretch>
                       <a:fillRect/>
@@ -9462,7 +9623,7 @@
         <w:rPr>
           <w:rtl w:val="0"/>
         </w:rPr>
-        <w:t xml:space="preserve"> file from your Github repository, translates the requirements, handles the target definitions, and sets up your application inside the </w:t>
+        <w:t xml:space="preserve"> file from your Github repository, translates the requirements, handles the target definitions, and sets up our application inside the </w:t>
       </w:r>
       <w:r>
         <w:rPr>
@@ -10315,8 +10476,8 @@
         <w:pStyle w:val="Heading3"/>
         <w:rPr/>
       </w:pPr>
-      <w:bookmarkStart w:colFirst="0" w:colLast="0" w:name="_rdqencegbs8v" w:id="16"/>
-      <w:bookmarkEnd w:id="16"/>
+      <w:bookmarkStart w:colFirst="0" w:colLast="0" w:name="_rdqencegbs8v" w:id="15"/>
+      <w:bookmarkEnd w:id="15"/>
       <w:r>
         <w:rPr>
           <w:rtl w:val="0"/>
@@ -10342,7 +10503,7 @@
         <w:rPr>
           <w:rtl w:val="0"/>
         </w:rPr>
-        <w:t xml:space="preserve">Verify that your application has been safely pulled and initiated within its designated workspace:</w:t>
+        <w:t xml:space="preserve">Let’s now verify that our application has been safely pulled and deployed within its designated workspace/namespace:</w:t>
       </w:r>
     </w:p>
     <w:p>
@@ -10435,31 +10596,21 @@
         <w:rPr/>
       </w:pPr>
       <w:r>
-        <w:rPr>
-          <w:rtl w:val="0"/>
-        </w:rPr>
-      </w:r>
-    </w:p>
-    <w:p>
-      <w:pPr>
-        <w:rPr/>
-      </w:pPr>
-      <w:r>
         <w:rPr/>
         <w:drawing>
           <wp:inline distB="114300" distT="114300" distL="114300" distR="114300">
             <wp:extent cx="5943600" cy="825500"/>
             <wp:effectExtent b="0" l="0" r="0" t="0"/>
-            <wp:docPr id="22" name="image14.png"/>
+            <wp:docPr id="22" name="image21.png"/>
             <a:graphic>
               <a:graphicData uri="http://schemas.openxmlformats.org/drawingml/2006/picture">
                 <pic:pic>
                   <pic:nvPicPr>
-                    <pic:cNvPr id="0" name="image14.png"/>
+                    <pic:cNvPr id="0" name="image21.png"/>
                     <pic:cNvPicPr preferRelativeResize="0"/>
                   </pic:nvPicPr>
                   <pic:blipFill>
-                    <a:blip r:embed="rId42"/>
+                    <a:blip r:embed="rId43"/>
                     <a:srcRect b="0" l="0" r="0" t="0"/>
                     <a:stretch>
                       <a:fillRect/>
@@ -10524,7 +10675,7 @@
         <w:rPr>
           <w:rtl w:val="0"/>
         </w:rPr>
-        <w:t xml:space="preserve">For every future code alteration or deployment update, you do not need to repeat any of the steps above. The automated loops trigger natively when a commit lands:</w:t>
+        <w:t xml:space="preserve">For every future code alteration or deployment update, we do not need to repeat any of the steps above. The automated loops trigger natively when a commit lands:</w:t>
       </w:r>
     </w:p>
     <w:p>
@@ -10561,26 +10712,6 @@
           <w:rtl w:val="0"/>
         </w:rPr>
         <w:t xml:space="preserve"> from your local workspace:</w:t>
-      </w:r>
-    </w:p>
-    <w:p>
-      <w:pPr>
-        <w:rPr/>
-      </w:pPr>
-      <w:r>
-        <w:rPr>
-          <w:rtl w:val="0"/>
-        </w:rPr>
-      </w:r>
-    </w:p>
-    <w:p>
-      <w:pPr>
-        <w:rPr/>
-      </w:pPr>
-      <w:r>
-        <w:rPr>
-          <w:rtl w:val="0"/>
-        </w:rPr>
       </w:r>
     </w:p>
     <w:tbl>
@@ -10697,8 +10828,8 @@
         <w:pStyle w:val="Heading3"/>
         <w:rPr/>
       </w:pPr>
-      <w:bookmarkStart w:colFirst="0" w:colLast="0" w:name="_wo01lh3h5m1l" w:id="17"/>
-      <w:bookmarkEnd w:id="17"/>
+      <w:bookmarkStart w:colFirst="0" w:colLast="0" w:name="_wo01lh3h5m1l" w:id="16"/>
+      <w:bookmarkEnd w:id="16"/>
       <w:r>
         <w:rPr>
           <w:rtl w:val="0"/>
@@ -10724,7 +10855,7 @@
         <w:rPr>
           <w:rtl w:val="0"/>
         </w:rPr>
-        <w:t xml:space="preserve">To access your newly deployed Python FastAPI application from your workstation, you have two clear options based on your NodePort configuration.</w:t>
+        <w:t xml:space="preserve">To access our newly deployed Python FastAPI application from our workstation, we have two options based on our NodePort configuration.</w:t>
       </w:r>
     </w:p>
     <w:p>
@@ -10774,17 +10905,7 @@
         <w:rPr>
           <w:rtl w:val="0"/>
         </w:rPr>
-        <w:t xml:space="preserve">Your python-app-service manifest correctly configured a NodePort service. Looking at your kubectl get output:</w:t>
-      </w:r>
-    </w:p>
-    <w:p>
-      <w:pPr>
-        <w:rPr/>
-      </w:pPr>
-      <w:r>
-        <w:rPr>
-          <w:rtl w:val="0"/>
-        </w:rPr>
+        <w:t xml:space="preserve">Our python-app-service manifest correctly configured a NodePort service. Looking at our kubectl get output:</w:t>
       </w:r>
     </w:p>
     <w:p>
@@ -10883,28 +11004,28 @@
         <w:rPr>
           <w:rtl w:val="0"/>
         </w:rPr>
-        <w:t xml:space="preserve">Kubernetes has opened port 30449 across every single physical node in your cluster.</w:t>
-      </w:r>
-    </w:p>
-    <w:p>
-      <w:pPr>
-        <w:rPr/>
-      </w:pPr>
-      <w:r>
-        <w:rPr>
-          <w:rtl w:val="0"/>
-        </w:rPr>
-      </w:r>
-    </w:p>
-    <w:p>
-      <w:pPr>
-        <w:rPr/>
-      </w:pPr>
-      <w:r>
-        <w:rPr>
-          <w:rtl w:val="0"/>
-        </w:rPr>
-        <w:t xml:space="preserve">To access the app directly, find the host IP address of any of your cluster nodes (such as the machine hosting worker-2 or worker-3) and navigate to it in your browser on that high port:</w:t>
+        <w:t xml:space="preserve">Kubernetes has opened port 30449 across every single physical node in our cluster.</w:t>
+      </w:r>
+    </w:p>
+    <w:p>
+      <w:pPr>
+        <w:rPr/>
+      </w:pPr>
+      <w:r>
+        <w:rPr>
+          <w:rtl w:val="0"/>
+        </w:rPr>
+      </w:r>
+    </w:p>
+    <w:p>
+      <w:pPr>
+        <w:rPr/>
+      </w:pPr>
+      <w:r>
+        <w:rPr>
+          <w:rtl w:val="0"/>
+        </w:rPr>
+        <w:t xml:space="preserve">To access the app directly, find the host IP address of any of the cluster nodes (such as the machine hosting worker-2 or worker-3) and navigate to it in using the browsers of choice on the  high port: (to the left of /TCP at the end of the line).</w:t>
       </w:r>
     </w:p>
     <w:p>
@@ -11053,28 +11174,28 @@
         <w:rPr>
           <w:rtl w:val="0"/>
         </w:rPr>
-        <w:t xml:space="preserve">If you want to map the cluster application specifically to your workstation's localhost:8000 interface for convenient local testing, you can instruct kubectl to open a secure, bidirectional network tunnel from your desktop straight to the service.</w:t>
-      </w:r>
-    </w:p>
-    <w:p>
-      <w:pPr>
-        <w:rPr/>
-      </w:pPr>
-      <w:r>
-        <w:rPr>
-          <w:rtl w:val="0"/>
-        </w:rPr>
-      </w:r>
-    </w:p>
-    <w:p>
-      <w:pPr>
-        <w:rPr/>
-      </w:pPr>
-      <w:r>
-        <w:rPr>
-          <w:rtl w:val="0"/>
-        </w:rPr>
-        <w:t xml:space="preserve">Run this command in a separate terminal window on your workstation:</w:t>
+        <w:t xml:space="preserve">If we want to map the cluster application specifically to your workstation's localhost:8000 interface for convenient local testing, we can instruct kubectl to open a secure, bidirectional network tunnel from our desktop straight to the service.</w:t>
+      </w:r>
+    </w:p>
+    <w:p>
+      <w:pPr>
+        <w:rPr/>
+      </w:pPr>
+      <w:r>
+        <w:rPr>
+          <w:rtl w:val="0"/>
+        </w:rPr>
+      </w:r>
+    </w:p>
+    <w:p>
+      <w:pPr>
+        <w:rPr/>
+      </w:pPr>
+      <w:r>
+        <w:rPr>
+          <w:rtl w:val="0"/>
+        </w:rPr>
+        <w:t xml:space="preserve">Run this command in a separate terminal window on our workstation:</w:t>
       </w:r>
     </w:p>
     <w:p>
@@ -11209,39 +11330,47 @@
         <w:rPr>
           <w:rtl w:val="0"/>
         </w:rPr>
-        <w:t xml:space="preserve">This binds your workstation's local port 8000 directly to the cluster service's incoming port 80.</w:t>
-      </w:r>
-    </w:p>
-    <w:p>
-      <w:pPr>
-        <w:rPr/>
-      </w:pPr>
-      <w:r>
-        <w:rPr>
-          <w:rtl w:val="0"/>
-        </w:rPr>
-        <w:t xml:space="preserve">Once that command is running, open your web browser and navigate to:</w:t>
-      </w:r>
-    </w:p>
-    <w:p>
-      <w:pPr>
-        <w:rPr/>
-      </w:pPr>
-      <w:r>
-        <w:rPr>
-          <w:rtl w:val="0"/>
-        </w:rPr>
-      </w:r>
-    </w:p>
-    <w:p>
-      <w:pPr>
-        <w:rPr/>
-      </w:pPr>
-      <w:r>
-        <w:rPr>
-          <w:rtl w:val="0"/>
-        </w:rPr>
-        <w:t xml:space="preserve">NOW, you may ask, but our app is exposed on port 8000 in the container, see the </w:t>
+        <w:t xml:space="preserve">This binds our workstation's local port 8000 directly to the cluster service's incoming port 80.</w:t>
+      </w:r>
+    </w:p>
+    <w:p>
+      <w:pPr>
+        <w:rPr/>
+      </w:pPr>
+      <w:r>
+        <w:rPr>
+          <w:rtl w:val="0"/>
+        </w:rPr>
+        <w:t xml:space="preserve">Once that command is running, open a web browser and navigate to:</w:t>
+      </w:r>
+    </w:p>
+    <w:p>
+      <w:pPr>
+        <w:rPr/>
+      </w:pPr>
+      <w:r>
+        <w:rPr>
+          <w:rtl w:val="0"/>
+        </w:rPr>
+      </w:r>
+    </w:p>
+    <w:p>
+      <w:pPr>
+        <w:rPr/>
+      </w:pPr>
+      <w:r>
+        <w:rPr>
+          <w:b w:val="1"/>
+          <w:bCs w:val="1"/>
+          <w:rtl w:val="0"/>
+        </w:rPr>
+        <w:t xml:space="preserve">NOW</w:t>
+      </w:r>
+      <w:r>
+        <w:rPr>
+          <w:rtl w:val="0"/>
+        </w:rPr>
+        <w:t xml:space="preserve">, you may ask, but our app is exposed on port 8000 in the container, see the </w:t>
       </w:r>
       <w:r>
         <w:rPr>
@@ -11277,28 +11406,28 @@
         <w:rPr>
           <w:rtl w:val="0"/>
         </w:rPr>
-        <w:t xml:space="preserve">Our configuration is actually completely correct as it stands, and you do not need to change the application's internal container port (8000).</w:t>
-      </w:r>
-    </w:p>
-    <w:p>
-      <w:pPr>
-        <w:rPr/>
-      </w:pPr>
-      <w:r>
-        <w:rPr>
-          <w:rtl w:val="0"/>
-        </w:rPr>
-      </w:r>
-    </w:p>
-    <w:p>
-      <w:pPr>
-        <w:rPr/>
-      </w:pPr>
-      <w:r>
-        <w:rPr>
-          <w:rtl w:val="0"/>
-        </w:rPr>
-        <w:t xml:space="preserve">In your Kubernetes manifest, you created a translation layer using the Service definition. Let's look at how the traffic flows:</w:t>
+        <w:t xml:space="preserve">Our configuration is actually completely correct as it stands, and we do not need to change the application's internal container port (8000).</w:t>
+      </w:r>
+    </w:p>
+    <w:p>
+      <w:pPr>
+        <w:rPr/>
+      </w:pPr>
+      <w:r>
+        <w:rPr>
+          <w:rtl w:val="0"/>
+        </w:rPr>
+      </w:r>
+    </w:p>
+    <w:p>
+      <w:pPr>
+        <w:rPr/>
+      </w:pPr>
+      <w:r>
+        <w:rPr>
+          <w:rtl w:val="0"/>
+        </w:rPr>
+        <w:t xml:space="preserve">In our Kubernetes manifest, we created a translation layer using the Service definition. Let's look at how the traffic flows:</w:t>
       </w:r>
     </w:p>
     <w:p>
@@ -11500,7 +11629,7 @@
         <w:rPr>
           <w:rtl w:val="0"/>
         </w:rPr>
-        <w:t xml:space="preserve">Because of this mapping, the Service listens on port 80 inside the cluster network and automatically shifts the traffic to port 8000 inside your Python container.</w:t>
+        <w:t xml:space="preserve">Because of this mapping, the Service listens on port 80 inside the cluster network and automatically shifts the traffic to port 8000 inside our Python container.</w:t>
       </w:r>
     </w:p>
     <w:p>
@@ -11529,28 +11658,28 @@
         <w:rPr>
           <w:rtl w:val="0"/>
         </w:rPr>
-        <w:t xml:space="preserve"> (kubectl port-forward) works with your setup:</w:t>
-      </w:r>
-    </w:p>
-    <w:p>
-      <w:pPr>
-        <w:rPr/>
-      </w:pPr>
-      <w:r>
-        <w:rPr>
-          <w:rtl w:val="0"/>
-        </w:rPr>
-      </w:r>
-    </w:p>
-    <w:p>
-      <w:pPr>
-        <w:rPr/>
-      </w:pPr>
-      <w:r>
-        <w:rPr>
-          <w:rtl w:val="0"/>
-        </w:rPr>
-        <w:t xml:space="preserve">When you run a port-forward command, you specify </w:t>
+        <w:t xml:space="preserve"> (kubectl port-forward) works with our setup:</w:t>
+      </w:r>
+    </w:p>
+    <w:p>
+      <w:pPr>
+        <w:rPr/>
+      </w:pPr>
+      <w:r>
+        <w:rPr>
+          <w:rtl w:val="0"/>
+        </w:rPr>
+      </w:r>
+    </w:p>
+    <w:p>
+      <w:pPr>
+        <w:rPr/>
+      </w:pPr>
+      <w:r>
+        <w:rPr>
+          <w:rtl w:val="0"/>
+        </w:rPr>
+        <w:t xml:space="preserve">When we run a port-forward command, we specify </w:t>
       </w:r>
       <w:r>
         <w:rPr>
@@ -11565,7 +11694,7 @@
         <w:rPr>
           <w:rtl w:val="0"/>
         </w:rPr>
-        <w:t xml:space="preserve">. Since your service is listening on port 80, your command should target port 80 like this:</w:t>
+        <w:t xml:space="preserve">. Since our service is listening on port 80, our command should target port 80 like this:</w:t>
       </w:r>
     </w:p>
     <w:p>
@@ -11666,16 +11795,16 @@
           <wp:inline distB="114300" distT="114300" distL="114300" distR="114300">
             <wp:extent cx="5943600" cy="774700"/>
             <wp:effectExtent b="0" l="0" r="0" t="0"/>
-            <wp:docPr id="2" name="image7.png"/>
+            <wp:docPr id="2" name="image17.png"/>
             <a:graphic>
               <a:graphicData uri="http://schemas.openxmlformats.org/drawingml/2006/picture">
                 <pic:pic>
                   <pic:nvPicPr>
-                    <pic:cNvPr id="0" name="image7.png"/>
+                    <pic:cNvPr id="0" name="image17.png"/>
                     <pic:cNvPicPr preferRelativeResize="0"/>
                   </pic:nvPicPr>
                   <pic:blipFill>
-                    <a:blip r:embed="rId43"/>
+                    <a:blip r:embed="rId44"/>
                     <a:srcRect b="0" l="0" r="0" t="0"/>
                     <a:stretch>
                       <a:fillRect/>
@@ -11719,17 +11848,7 @@
         <w:rPr>
           <w:rtl w:val="0"/>
         </w:rPr>
-        <w:t xml:space="preserve">In a new terminal</w:t>
-      </w:r>
-    </w:p>
-    <w:p>
-      <w:pPr>
-        <w:rPr/>
-      </w:pPr>
-      <w:r>
-        <w:rPr>
-          <w:rtl w:val="0"/>
-        </w:rPr>
+        <w:t xml:space="preserve">In a new terminal, execute the below.</w:t>
       </w:r>
     </w:p>
     <w:tbl>
@@ -11820,16 +11939,16 @@
           <wp:inline distB="114300" distT="114300" distL="114300" distR="114300">
             <wp:extent cx="5943600" cy="1257300"/>
             <wp:effectExtent b="0" l="0" r="0" t="0"/>
-            <wp:docPr id="13" name="image17.png"/>
+            <wp:docPr id="14" name="image7.png"/>
             <a:graphic>
               <a:graphicData uri="http://schemas.openxmlformats.org/drawingml/2006/picture">
                 <pic:pic>
                   <pic:nvPicPr>
-                    <pic:cNvPr id="0" name="image17.png"/>
+                    <pic:cNvPr id="0" name="image7.png"/>
                     <pic:cNvPicPr preferRelativeResize="0"/>
                   </pic:nvPicPr>
                   <pic:blipFill>
-                    <a:blip r:embed="rId44"/>
+                    <a:blip r:embed="rId45"/>
                     <a:srcRect b="0" l="0" r="0" t="0"/>
                     <a:stretch>
                       <a:fillRect/>
@@ -11873,7 +11992,7 @@
         <w:rPr>
           <w:rtl w:val="0"/>
         </w:rPr>
-        <w:t xml:space="preserve">You can also navigate with your browser to go to </w:t>
+        <w:t xml:space="preserve">We can now navigate with our browser to any of the below addresses:</w:t>
       </w:r>
     </w:p>
     <w:p>
@@ -11897,7 +12016,7 @@
           <w:u w:val="none"/>
         </w:rPr>
       </w:pPr>
-      <w:hyperlink r:id="rId45">
+      <w:hyperlink r:id="rId46">
         <w:r>
           <w:rPr>
             <w:color w:val="1155cc"/>
@@ -11925,7 +12044,7 @@
           <w:u w:val="none"/>
         </w:rPr>
       </w:pPr>
-      <w:hyperlink r:id="rId46">
+      <w:hyperlink r:id="rId47">
         <w:r>
           <w:rPr>
             <w:color w:val="1155cc"/>
@@ -11953,7 +12072,7 @@
           <w:u w:val="none"/>
         </w:rPr>
       </w:pPr>
-      <w:hyperlink r:id="rId47">
+      <w:hyperlink r:id="rId48">
         <w:r>
           <w:rPr>
             <w:color w:val="1155cc"/>
@@ -11981,7 +12100,7 @@
           <w:u w:val="none"/>
         </w:rPr>
       </w:pPr>
-      <w:hyperlink r:id="rId48">
+      <w:hyperlink r:id="rId49">
         <w:r>
           <w:rPr>
             <w:color w:val="1155cc"/>
@@ -12016,6 +12135,17 @@
         <w:rPr>
           <w:rtl w:val="0"/>
         </w:rPr>
+        <w:t xml:space="preserve">What we build:</w:t>
+      </w:r>
+    </w:p>
+    <w:p>
+      <w:pPr>
+        <w:rPr/>
+      </w:pPr>
+      <w:r>
+        <w:rPr>
+          <w:rtl w:val="0"/>
+        </w:rPr>
       </w:r>
     </w:p>
     <w:p>
@@ -12094,7 +12224,7 @@
       <w:pPr>
         <w:rPr/>
       </w:pPr>
-      <w:hyperlink r:id="rId49">
+      <w:hyperlink r:id="rId50">
         <w:r>
           <w:rPr>
             <w:rFonts w:ascii="Cambria" w:cs="Cambria" w:eastAsia="Cambria" w:hAnsi="Cambria"/>
@@ -12116,68 +12246,25 @@
     </w:p>
     <w:p>
       <w:pPr>
-        <w:rPr/>
-      </w:pPr>
-      <w:r>
-        <w:rPr>
-          <w:rtl w:val="0"/>
-        </w:rPr>
-      </w:r>
-    </w:p>
-    <w:p>
-      <w:pPr>
-        <w:rPr/>
-      </w:pPr>
-      <w:r>
-        <w:rPr>
-          <w:rtl w:val="0"/>
-        </w:rPr>
-      </w:r>
-    </w:p>
-    <w:p>
-      <w:pPr>
         <w:pStyle w:val="Heading2"/>
-        <w:rPr/>
-      </w:pPr>
-      <w:bookmarkStart w:colFirst="0" w:colLast="0" w:name="_4fafqny6su1j" w:id="18"/>
-      <w:bookmarkEnd w:id="18"/>
-      <w:r>
-        <w:rPr>
-          <w:rtl w:val="0"/>
-        </w:rPr>
-        <w:t xml:space="preserve">Scope creep</w:t>
-      </w:r>
-    </w:p>
-    <w:p>
-      <w:pPr>
         <w:rPr>
           <w:b w:val="1"/>
           <w:bCs w:val="1"/>
           <w:color w:val="cc0000"/>
         </w:rPr>
       </w:pPr>
-      <w:r>
-        <w:rPr>
-          <w:rtl w:val="0"/>
-        </w:rPr>
-      </w:r>
-    </w:p>
-    <w:p>
-      <w:pPr>
-        <w:rPr>
-          <w:b w:val="1"/>
-          <w:bCs w:val="1"/>
-          <w:color w:val="cc0000"/>
-        </w:rPr>
-      </w:pPr>
-      <w:r>
-        <w:rPr>
-          <w:b w:val="1"/>
-          <w:bCs w:val="1"/>
-          <w:color w:val="cc0000"/>
-          <w:rtl w:val="0"/>
-        </w:rPr>
-        <w:t xml:space="preserve">– NEED To Test/Verify the below still</w:t>
+      <w:bookmarkStart w:colFirst="0" w:colLast="0" w:name="_4fafqny6su1j" w:id="17"/>
+      <w:bookmarkEnd w:id="17"/>
+      <w:r>
+        <w:rPr>
+          <w:rtl w:val="0"/>
+        </w:rPr>
+        <w:t xml:space="preserve">Scope creep, whenever does this not happen.</w:t>
+      </w:r>
+      <w:r>
+        <w:rPr>
+          <w:rtl w:val="0"/>
+        </w:rPr>
       </w:r>
     </w:p>
     <w:p>
@@ -12278,7 +12365,7 @@
         <w:rPr>
           <w:rtl w:val="0"/>
         </w:rPr>
-        <w:t xml:space="preserve">: to be able to roll back, if required, I’ve placed backup copies of all the files which we will modify as part of the app2 deployment.</w:t>
+        <w:t xml:space="preserve">: to be able to roll back, if required, I’ve placed backup copies of all the original files which we will modify as part of the app2 deployment in a backup folder.</w:t>
       </w:r>
     </w:p>
     <w:p>
@@ -12286,8 +12373,8 @@
         <w:pStyle w:val="Heading3"/>
         <w:rPr/>
       </w:pPr>
-      <w:bookmarkStart w:colFirst="0" w:colLast="0" w:name="_pqwaksgz3hds" w:id="19"/>
-      <w:bookmarkEnd w:id="19"/>
+      <w:bookmarkStart w:colFirst="0" w:colLast="0" w:name="_pqwaksgz3hds" w:id="18"/>
+      <w:bookmarkEnd w:id="18"/>
       <w:r>
         <w:rPr>
           <w:rtl w:val="0"/>
@@ -12992,48 +13079,64 @@
     </w:p>
     <w:p>
       <w:pPr>
+        <w:rPr/>
+      </w:pPr>
+      <w:r>
+        <w:rPr>
+          <w:b w:val="1"/>
+          <w:bCs w:val="1"/>
+          <w:rtl w:val="0"/>
+        </w:rPr>
+        <w:t xml:space="preserve">Step 1:</w:t>
+      </w:r>
+      <w:r>
+        <w:rPr>
+          <w:rtl w:val="0"/>
+        </w:rPr>
+        <w:t xml:space="preserve"> To deploy we will copy/replace the current file: </w:t>
+      </w:r>
+      <w:r>
         <w:rPr>
           <w:rFonts w:ascii="Courier New" w:cs="Courier New" w:eastAsia="Courier New" w:hAnsi="Courier New"/>
           <w:b w:val="1"/>
           <w:bCs w:val="1"/>
-        </w:rPr>
-      </w:pPr>
-      <w:r>
-        <w:rPr>
-          <w:b w:val="1"/>
-          <w:bCs w:val="1"/>
-          <w:rtl w:val="0"/>
-        </w:rPr>
-        <w:t xml:space="preserve">Step 1:</w:t>
-      </w:r>
-      <w:r>
-        <w:rPr>
-          <w:rtl w:val="0"/>
-        </w:rPr>
-        <w:t xml:space="preserve"> To deploy we will copy/replace the current file: </w:t>
-      </w:r>
-      <w:r>
-        <w:rPr>
-          <w:rFonts w:ascii="Courier New" w:cs="Courier New" w:eastAsia="Courier New" w:hAnsi="Courier New"/>
-          <w:b w:val="1"/>
-          <w:bCs w:val="1"/>
-          <w:rtl w:val="0"/>
-        </w:rPr>
-        <w:t xml:space="preserve">k8s/deployment.yml</w:t>
-      </w:r>
-    </w:p>
-    <w:p>
-      <w:pPr>
-        <w:rPr>
-          <w:rFonts w:ascii="Courier New" w:cs="Courier New" w:eastAsia="Courier New" w:hAnsi="Courier New"/>
-          <w:b w:val="1"/>
-          <w:bCs w:val="1"/>
-        </w:rPr>
-      </w:pPr>
-      <w:r>
-        <w:rPr>
-          <w:rtl w:val="0"/>
-        </w:rPr>
+          <w:rtl w:val="0"/>
+        </w:rPr>
+        <w:t xml:space="preserve">k8s/deployment.yml </w:t>
+      </w:r>
+      <w:r>
+        <w:rPr>
+          <w:rtl w:val="0"/>
+        </w:rPr>
+        <w:t xml:space="preserve">w</w:t>
+      </w:r>
+      <w:r>
+        <w:rPr>
+          <w:rtl w:val="0"/>
+        </w:rPr>
+        <w:t xml:space="preserve">ith:</w:t>
+      </w:r>
+    </w:p>
+    <w:p>
+      <w:pPr>
+        <w:rPr/>
+      </w:pPr>
+      <w:r>
+        <w:rPr>
+          <w:rtl w:val="0"/>
+        </w:rPr>
+        <w:t xml:space="preserve">(See the new app2 section ¾ down).</w:t>
+      </w:r>
+    </w:p>
+    <w:p>
+      <w:pPr>
+        <w:rPr/>
+      </w:pPr>
+      <w:r>
+        <w:rPr>
+          <w:rtl w:val="0"/>
+        </w:rPr>
+        <w:t xml:space="preserve"> </w:t>
       </w:r>
     </w:p>
     <w:p>
@@ -14496,43 +14599,52 @@
     </w:p>
     <w:p>
       <w:pPr>
+        <w:rPr/>
+      </w:pPr>
+      <w:r>
+        <w:rPr>
+          <w:b w:val="1"/>
+          <w:bCs w:val="1"/>
+          <w:rtl w:val="0"/>
+        </w:rPr>
+        <w:t xml:space="preserve">Step 2:</w:t>
+      </w:r>
+      <w:r>
+        <w:rPr>
+          <w:rtl w:val="0"/>
+        </w:rPr>
+        <w:t xml:space="preserve"> To deploy we will copy/replace the current file: </w:t>
+      </w:r>
+      <w:r>
         <w:rPr>
           <w:rFonts w:ascii="Courier New" w:cs="Courier New" w:eastAsia="Courier New" w:hAnsi="Courier New"/>
           <w:b w:val="1"/>
           <w:bCs w:val="1"/>
-        </w:rPr>
-      </w:pPr>
-      <w:r>
-        <w:rPr>
-          <w:b w:val="1"/>
-          <w:bCs w:val="1"/>
-          <w:rtl w:val="0"/>
-        </w:rPr>
-        <w:t xml:space="preserve">Step 2:</w:t>
-      </w:r>
-      <w:r>
-        <w:rPr>
-          <w:rtl w:val="0"/>
-        </w:rPr>
-        <w:t xml:space="preserve"> To deploy we will copy/replace the current file: </w:t>
-      </w:r>
-      <w:r>
-        <w:rPr>
-          <w:rFonts w:ascii="Courier New" w:cs="Courier New" w:eastAsia="Courier New" w:hAnsi="Courier New"/>
-          <w:b w:val="1"/>
-          <w:bCs w:val="1"/>
-          <w:rtl w:val="0"/>
-        </w:rPr>
-        <w:t xml:space="preserve">.github/workflows/ci.yml</w:t>
-      </w:r>
-    </w:p>
-    <w:p>
-      <w:pPr>
-        <w:rPr>
-          <w:rFonts w:ascii="Courier New" w:cs="Courier New" w:eastAsia="Courier New" w:hAnsi="Courier New"/>
-          <w:b w:val="1"/>
-          <w:bCs w:val="1"/>
-        </w:rPr>
+          <w:rtl w:val="0"/>
+        </w:rPr>
+        <w:t xml:space="preserve">.github/workflows/ci.yml </w:t>
+      </w:r>
+      <w:r>
+        <w:rPr>
+          <w:rtl w:val="0"/>
+        </w:rPr>
+        <w:t xml:space="preserve">with:</w:t>
+      </w:r>
+    </w:p>
+    <w:p>
+      <w:pPr>
+        <w:rPr/>
+      </w:pPr>
+      <w:r>
+        <w:rPr>
+          <w:rtl w:val="0"/>
+        </w:rPr>
+        <w:t xml:space="preserve">(See the new Build APP2 section ¾ down).</w:t>
+      </w:r>
+    </w:p>
+    <w:p>
+      <w:pPr>
+        <w:rPr/>
       </w:pPr>
       <w:r>
         <w:rPr>
@@ -16334,7 +16446,7 @@
         <w:rPr>
           <w:rtl w:val="0"/>
         </w:rPr>
-        <w:t xml:space="preserve">Since ArgoCD is already tracking your k8s/ folder via your existing application setup, you don't even need to register a new file with ArgoCD! The moment you commit these additions, ArgoCD will notice the appended blocks at the bottom of the manifest and natively deploy them.</w:t>
+        <w:t xml:space="preserve">Since ArgoCD is already tracking your k8s/ folder via our existing application setup, we don't even need to register a new file with ArgoCD! The moment we commit these additions, ArgoCD will notice the appended blocks at the bottom of the manifest and natively deploy them.</w:t>
       </w:r>
     </w:p>
     <w:p>
@@ -16356,16 +16468,6 @@
           <w:rtl w:val="0"/>
         </w:rPr>
         <w:t xml:space="preserve">Execute the following commands locally after copying the new artefacts as per above:</w:t>
-      </w:r>
-    </w:p>
-    <w:p>
-      <w:pPr>
-        <w:rPr/>
-      </w:pPr>
-      <w:r>
-        <w:rPr>
-          <w:rtl w:val="0"/>
-        </w:rPr>
       </w:r>
     </w:p>
     <w:tbl>
@@ -16555,7 +16657,7 @@
         <w:rPr>
           <w:rtl w:val="0"/>
         </w:rPr>
-        <w:t xml:space="preserve">Once the pipeline goes green, verify both components are happily coexisting in your cluster under their own namespaces:</w:t>
+        <w:t xml:space="preserve">Once the pipeline goes green, we can verify that both components are happily coexisting in our cluster under their own namespaces:</w:t>
       </w:r>
     </w:p>
     <w:p>
@@ -16591,7 +16693,22 @@
         <w:rPr>
           <w:rtl w:val="0"/>
         </w:rPr>
-        <w:t xml:space="preserve"> as updated by the Github Actions process. Take note both placeholders on line 21 and 75 have been updated.</w:t>
+        <w:t xml:space="preserve"> as updated by the Github Actions process. Take note both </w:t>
+      </w:r>
+      <w:r>
+        <w:rPr>
+          <w:rFonts w:ascii="Courier New" w:cs="Courier New" w:eastAsia="Courier New" w:hAnsi="Courier New"/>
+          <w:b w:val="1"/>
+          <w:bCs w:val="1"/>
+          <w:rtl w:val="0"/>
+        </w:rPr>
+        <w:t xml:space="preserve">:placeholders</w:t>
+      </w:r>
+      <w:r>
+        <w:rPr>
+          <w:rtl w:val="0"/>
+        </w:rPr>
+        <w:t xml:space="preserve"> on line 21 and 75 have been updated.</w:t>
       </w:r>
     </w:p>
     <w:p>
@@ -18079,9 +18196,9 @@
         <w:rPr>
           <w:rtl w:val="0"/>
         </w:rPr>
-        <w:t xml:space="preserve"> You </w:t>
-      </w:r>
-      <w:hyperlink r:id="rId50">
+        <w:t xml:space="preserve"> Our </w:t>
+      </w:r>
+      <w:hyperlink r:id="rId51">
         <w:r>
           <w:rPr>
             <w:color w:val="1155cc"/>
@@ -18093,9 +18210,18 @@
       </w:hyperlink>
       <w:r>
         <w:rPr>
-          <w:rtl w:val="0"/>
-        </w:rPr>
-        <w:t xml:space="preserve"> Personal Access Token will allow Github Actions to create a new repository which will contain the new image. You will also notice that both app and app2 tags are the same. This is due to the fact that the Github Actions runner compiled, build both images during the same execution process.</w:t>
+          <w:rFonts w:ascii="Courier New" w:cs="Courier New" w:eastAsia="Courier New" w:hAnsi="Courier New"/>
+          <w:b w:val="1"/>
+          <w:bCs w:val="1"/>
+          <w:rtl w:val="0"/>
+        </w:rPr>
+        <w:t xml:space="preserve"> Personal Access Token</w:t>
+      </w:r>
+      <w:r>
+        <w:rPr>
+          <w:rtl w:val="0"/>
+        </w:rPr>
+        <w:t xml:space="preserve"> allows Github Actions to create the new repository required for app2 which will contain the new image. We will also notice that both app and app2 tags are the same. This is due to the fact that the Github Actions runner compiled, build both images during the same execution process.</w:t>
       </w:r>
     </w:p>
     <w:p>
@@ -18202,16 +18328,16 @@
           <wp:inline distB="114300" distT="114300" distL="114300" distR="114300">
             <wp:extent cx="5943600" cy="812800"/>
             <wp:effectExtent b="0" l="0" r="0" t="0"/>
-            <wp:docPr id="10" name="image3.png"/>
+            <wp:docPr id="11" name="image14.png"/>
             <a:graphic>
               <a:graphicData uri="http://schemas.openxmlformats.org/drawingml/2006/picture">
                 <pic:pic>
                   <pic:nvPicPr>
-                    <pic:cNvPr id="0" name="image3.png"/>
+                    <pic:cNvPr id="0" name="image14.png"/>
                     <pic:cNvPicPr preferRelativeResize="0"/>
                   </pic:nvPicPr>
                   <pic:blipFill>
-                    <a:blip r:embed="rId51"/>
+                    <a:blip r:embed="rId52"/>
                     <a:srcRect b="0" l="0" r="0" t="0"/>
                     <a:stretch>
                       <a:fillRect/>
@@ -18272,7 +18398,7 @@
                     <pic:cNvPicPr preferRelativeResize="0"/>
                   </pic:nvPicPr>
                   <pic:blipFill>
-                    <a:blip r:embed="rId52"/>
+                    <a:blip r:embed="rId53"/>
                     <a:srcRect b="0" l="0" r="0" t="0"/>
                     <a:stretch>
                       <a:fillRect/>
@@ -18547,16 +18673,16 @@
           <wp:inline distB="114300" distT="114300" distL="114300" distR="114300">
             <wp:extent cx="5943600" cy="990600"/>
             <wp:effectExtent b="0" l="0" r="0" t="0"/>
-            <wp:docPr id="4" name="image15.png"/>
+            <wp:docPr id="5" name="image19.png"/>
             <a:graphic>
               <a:graphicData uri="http://schemas.openxmlformats.org/drawingml/2006/picture">
                 <pic:pic>
                   <pic:nvPicPr>
-                    <pic:cNvPr id="0" name="image15.png"/>
+                    <pic:cNvPr id="0" name="image19.png"/>
                     <pic:cNvPicPr preferRelativeResize="0"/>
                   </pic:nvPicPr>
                   <pic:blipFill>
-                    <a:blip r:embed="rId53"/>
+                    <a:blip r:embed="rId54"/>
                     <a:srcRect b="0" l="0" r="0" t="0"/>
                     <a:stretch>
                       <a:fillRect/>
@@ -18600,7 +18726,7 @@
         <w:rPr>
           <w:rtl w:val="0"/>
         </w:rPr>
-        <w:t xml:space="preserve">You can also navigate with you browser to go to:</w:t>
+        <w:t xml:space="preserve">We can now also navigate using our browser to:</w:t>
       </w:r>
     </w:p>
     <w:p>
@@ -18624,11 +18750,21 @@
           <w:u w:val="none"/>
         </w:rPr>
       </w:pPr>
-      <w:r>
-        <w:rPr>
-          <w:rtl w:val="0"/>
-        </w:rPr>
-        <w:t xml:space="preserve">http://localhost:9080/ or </w:t>
+      <w:hyperlink r:id="rId55">
+        <w:r>
+          <w:rPr>
+            <w:color w:val="1155cc"/>
+            <w:u w:val="single"/>
+            <w:rtl w:val="0"/>
+          </w:rPr>
+          <w:t xml:space="preserve">http://localhost:9080/</w:t>
+        </w:r>
+      </w:hyperlink>
+      <w:r>
+        <w:rPr>
+          <w:rtl w:val="0"/>
+        </w:rPr>
+        <w:t xml:space="preserve"> or </w:t>
       </w:r>
     </w:p>
     <w:p>
@@ -18642,11 +18778,21 @@
           <w:u w:val="none"/>
         </w:rPr>
       </w:pPr>
-      <w:r>
-        <w:rPr>
-          <w:rtl w:val="0"/>
-        </w:rPr>
-        <w:t xml:space="preserve">http://localhost:9080/healthz or similarly to </w:t>
+      <w:hyperlink r:id="rId56">
+        <w:r>
+          <w:rPr>
+            <w:color w:val="1155cc"/>
+            <w:u w:val="single"/>
+            <w:rtl w:val="0"/>
+          </w:rPr>
+          <w:t xml:space="preserve">http://localhost:9080/healthz</w:t>
+        </w:r>
+      </w:hyperlink>
+      <w:r>
+        <w:rPr>
+          <w:rtl w:val="0"/>
+        </w:rPr>
+        <w:t xml:space="preserve"> or similarly to </w:t>
       </w:r>
     </w:p>
     <w:p>
@@ -18660,7 +18806,7 @@
           <w:u w:val="none"/>
         </w:rPr>
       </w:pPr>
-      <w:hyperlink r:id="rId54">
+      <w:hyperlink r:id="rId57">
         <w:r>
           <w:rPr>
             <w:color w:val="1155cc"/>
@@ -18687,11 +18833,21 @@
           <w:u w:val="none"/>
         </w:rPr>
       </w:pPr>
-      <w:r>
-        <w:rPr>
-          <w:rtl w:val="0"/>
-        </w:rPr>
-        <w:t xml:space="preserve">http://127.0.0.1:9080/health</w:t>
+      <w:hyperlink r:id="rId58">
+        <w:r>
+          <w:rPr>
+            <w:color w:val="1155cc"/>
+            <w:u w:val="single"/>
+            <w:rtl w:val="0"/>
+          </w:rPr>
+          <w:t xml:space="preserve">http://127.0.0.1:9080/health</w:t>
+        </w:r>
+      </w:hyperlink>
+      <w:r>
+        <w:rPr>
+          <w:rtl w:val="0"/>
+        </w:rPr>
+        <w:t xml:space="preserve"> </w:t>
       </w:r>
     </w:p>
     <w:p>
@@ -18709,13 +18865,34 @@
         <w:pStyle w:val="Heading3"/>
         <w:rPr/>
       </w:pPr>
-      <w:bookmarkStart w:colFirst="0" w:colLast="0" w:name="_xvb8liug5rk6" w:id="20"/>
-      <w:bookmarkEnd w:id="20"/>
+      <w:bookmarkStart w:colFirst="0" w:colLast="0" w:name="_xvb8liug5rk6" w:id="19"/>
+      <w:bookmarkEnd w:id="19"/>
       <w:r>
         <w:rPr>
           <w:rtl w:val="0"/>
         </w:rPr>
         <w:t xml:space="preserve">To access our ArgoCD Management Console:</w:t>
+      </w:r>
+    </w:p>
+    <w:p>
+      <w:pPr>
+        <w:rPr/>
+      </w:pPr>
+      <w:r>
+        <w:rPr>
+          <w:rtl w:val="0"/>
+        </w:rPr>
+      </w:r>
+    </w:p>
+    <w:p>
+      <w:pPr>
+        <w:rPr/>
+      </w:pPr>
+      <w:r>
+        <w:rPr>
+          <w:rtl w:val="0"/>
+        </w:rPr>
+        <w:t xml:space="preserve">ArgoCD itself comes with a fully functional Console/UI, to access it.</w:t>
       </w:r>
     </w:p>
     <w:p>
@@ -18740,7 +18917,7 @@
         <w:rPr>
           <w:rtl w:val="0"/>
         </w:rPr>
-        <w:t xml:space="preserve">Default Username and password: </w:t>
+        <w:t xml:space="preserve">Firstly, the default username is: </w:t>
       </w:r>
       <w:r>
         <w:rPr>
@@ -18770,7 +18947,7 @@
       <w:pPr>
         <w:rPr/>
       </w:pPr>
-      <w:hyperlink r:id="rId55">
+      <w:hyperlink r:id="rId59">
         <w:r>
           <w:rPr>
             <w:rFonts w:ascii="Cambria" w:cs="Cambria" w:eastAsia="Cambria" w:hAnsi="Cambria"/>
@@ -18789,11 +18966,6 @@
         </w:rPr>
         <w:t xml:space="preserve"> creates a random password during installation. This can be retrieved using the below command.</w:t>
       </w:r>
-    </w:p>
-    <w:p>
-      <w:pPr>
-        <w:rPr/>
-      </w:pPr>
       <w:r>
         <w:rPr>
           <w:rtl w:val="0"/>
@@ -18907,16 +19079,16 @@
           <wp:inline distB="114300" distT="114300" distL="114300" distR="114300">
             <wp:extent cx="5943600" cy="584200"/>
             <wp:effectExtent b="0" l="0" r="0" t="0"/>
-            <wp:docPr id="6" name="image4.png"/>
+            <wp:docPr id="7" name="image3.png"/>
             <a:graphic>
               <a:graphicData uri="http://schemas.openxmlformats.org/drawingml/2006/picture">
                 <pic:pic>
                   <pic:nvPicPr>
-                    <pic:cNvPr id="0" name="image4.png"/>
+                    <pic:cNvPr id="0" name="image3.png"/>
                     <pic:cNvPicPr preferRelativeResize="0"/>
                   </pic:nvPicPr>
                   <pic:blipFill>
-                    <a:blip r:embed="rId56"/>
+                    <a:blip r:embed="rId60"/>
                     <a:srcRect b="0" l="0" r="0" t="0"/>
                     <a:stretch>
                       <a:fillRect/>
@@ -18952,11 +19124,6 @@
         </w:rPr>
         <w:t xml:space="preserve">Now to Access the Console we first need to configure another port-forward (note we’re using 8081 for this as we previously above already utilised 8080):</w:t>
       </w:r>
-    </w:p>
-    <w:p>
-      <w:pPr>
-        <w:rPr/>
-      </w:pPr>
       <w:r>
         <w:rPr>
           <w:rtl w:val="0"/>
@@ -18973,16 +19140,16 @@
           <wp:inline distB="114300" distT="114300" distL="114300" distR="114300">
             <wp:extent cx="5943600" cy="800100"/>
             <wp:effectExtent b="0" l="0" r="0" t="0"/>
-            <wp:docPr id="21" name="image19.png"/>
+            <wp:docPr id="21" name="image18.png"/>
             <a:graphic>
               <a:graphicData uri="http://schemas.openxmlformats.org/drawingml/2006/picture">
                 <pic:pic>
                   <pic:nvPicPr>
-                    <pic:cNvPr id="0" name="image19.png"/>
+                    <pic:cNvPr id="0" name="image18.png"/>
                     <pic:cNvPicPr preferRelativeResize="0"/>
                   </pic:nvPicPr>
                   <pic:blipFill>
-                    <a:blip r:embed="rId57"/>
+                    <a:blip r:embed="rId61"/>
                     <a:srcRect b="0" l="0" r="0" t="0"/>
                     <a:stretch>
                       <a:fillRect/>
@@ -19019,16 +19186,16 @@
           <wp:inline distB="114300" distT="114300" distL="114300" distR="114300">
             <wp:extent cx="5943600" cy="3581400"/>
             <wp:effectExtent b="0" l="0" r="0" t="0"/>
-            <wp:docPr id="5" name="image9.png"/>
+            <wp:docPr id="6" name="image20.png"/>
             <a:graphic>
               <a:graphicData uri="http://schemas.openxmlformats.org/drawingml/2006/picture">
                 <pic:pic>
                   <pic:nvPicPr>
-                    <pic:cNvPr id="0" name="image9.png"/>
+                    <pic:cNvPr id="0" name="image20.png"/>
                     <pic:cNvPicPr preferRelativeResize="0"/>
                   </pic:nvPicPr>
                   <pic:blipFill>
-                    <a:blip r:embed="rId58"/>
+                    <a:blip r:embed="rId62"/>
                     <a:srcRect b="0" l="0" r="0" t="0"/>
                     <a:stretch>
                       <a:fillRect/>
@@ -19096,16 +19263,6 @@
           <w:rtl w:val="0"/>
         </w:rPr>
         <w:t xml:space="preserve"> you will be getting the below error stack:</w:t>
-      </w:r>
-    </w:p>
-    <w:p>
-      <w:pPr>
-        <w:rPr/>
-      </w:pPr>
-      <w:r>
-        <w:rPr>
-          <w:rtl w:val="0"/>
-        </w:rPr>
       </w:r>
     </w:p>
     <w:p>
@@ -19228,16 +19385,6 @@
         <w:t xml:space="preserve">Results in:</w:t>
       </w:r>
     </w:p>
-    <w:p>
-      <w:pPr>
-        <w:rPr/>
-      </w:pPr>
-      <w:r>
-        <w:rPr>
-          <w:rtl w:val="0"/>
-        </w:rPr>
-      </w:r>
-    </w:p>
     <w:tbl>
       <w:tblPr>
         <w:tblStyle w:val="Table41"/>
@@ -19634,8 +19781,8 @@
           <w:szCs w:val="28"/>
         </w:rPr>
       </w:pPr>
-      <w:bookmarkStart w:colFirst="0" w:colLast="0" w:name="_z54a7ilggs2u" w:id="21"/>
-      <w:bookmarkEnd w:id="21"/>
+      <w:bookmarkStart w:colFirst="0" w:colLast="0" w:name="_z54a7ilggs2u" w:id="20"/>
+      <w:bookmarkEnd w:id="20"/>
       <w:r>
         <w:rPr>
           <w:rFonts w:ascii="Calibri" w:cs="Calibri" w:eastAsia="Calibri" w:hAnsi="Calibri"/>
@@ -19669,7 +19816,7 @@
         </w:rPr>
         <w:t xml:space="preserve">Well, I could try and write a long summary here, but, that was it, really very simple. All enabled on our local desktop/laptop by running a Kubernetes cluster inside </w:t>
       </w:r>
-      <w:hyperlink r:id="rId59">
+      <w:hyperlink r:id="rId63">
         <w:r>
           <w:rPr>
             <w:rFonts w:ascii="Cambria" w:cs="Cambria" w:eastAsia="Cambria" w:hAnsi="Cambria"/>
@@ -19683,18 +19830,9 @@
       </w:hyperlink>
       <w:r>
         <w:rPr>
-          <w:rFonts w:ascii="Cambria" w:cs="Cambria" w:eastAsia="Cambria" w:hAnsi="Cambria"/>
-          <w:sz w:val="24"/>
-          <w:szCs w:val="24"/>
-          <w:rtl w:val="0"/>
-        </w:rPr>
-        <w:t xml:space="preserve"> </w:t>
-      </w:r>
-      <w:r>
-        <w:rPr>
-          <w:rtl w:val="0"/>
-        </w:rPr>
-        <w:t xml:space="preserve">.</w:t>
+          <w:rtl w:val="0"/>
+        </w:rPr>
+        <w:t xml:space="preserve">. The above and previous blogs provide us with a complete framework, allowing for real world development environment, with minimal to no changes when we deploy to a production Kubernetes cluster.</w:t>
       </w:r>
     </w:p>
     <w:p>

</xml_diff>